<commit_message>
added tests for all possible signed operations
</commit_message>
<xml_diff>
--- a/docs/documentation.docx
+++ b/docs/documentation.docx
@@ -761,7 +761,7 @@
         <ns0:ind ns0:hanging="240" ns0:left="480"/>
       </ns0:pPr>
       <ns0:r>
-        <ns0:t>• Non-default SECTION_WIDTH values are not fully supported because kernel writes update only 256 bits.</ns0:t>
+        <ns0:t>• Non-default SECTION_WIDTH values are not fully supported yet.</ns0:t>
       </ns0:r>
     </ns0:p>
     <ns0:p>
@@ -790,7 +790,7 @@
     </ns0:p>
     <ns0:p>
       <ns0:r>
-        <ns0:t>spatz_dimc, instantiated as i_dut with SECTION_WIDTH=256. Compute tests use MODE=11 and sign_8b=00.</ns0:t>
+        <ns0:t>spatz_dimc, instantiated as i_dut with SECTION_WIDTH=256. Compute tests use MODE=11; Tests 5–7 use sign_8b=00 and Test 8 uses sign_8b=01, 10, and 11.</ns0:t>
       </ns0:r>
     </ns0:p>
     <ns0:p>
@@ -806,7 +806,7 @@
         <ns0:ind ns0:hanging="240" ns0:left="480"/>
       </ns0:pPr>
       <ns0:r>
-        <ns0:t>• sign_8b=00 treats both kernel weights and feature data as unsigned.</ns0:t>
+        <ns0:t>• sign_8b selects operand signedness: 00 unsigned/unsigned, 01 signed/unsigned, 10 unsigned/signed, and 11 signed/signed for kernel/feature.</ns0:t>
       </ns0:r>
     </ns0:p>
     <ns0:p>
@@ -928,7 +928,7 @@
                 <ns0:sz ns0:val="19"/>
                 <ns0:szCs ns0:val="19"/>
               </ns0:rPr>
-              <ns0:t>Kernel data for Tests 2–7.</ns0:t>
+              <ns0:t>Kernel data for Tests 2–8.</ns0:t>
             </ns0:r>
           </ns0:p>
         </ns0:tc>
@@ -976,7 +976,7 @@
                 <ns0:sz ns0:val="19"/>
                 <ns0:szCs ns0:val="19"/>
               </ns0:rPr>
-              <ns0:t>Input vector for Tests 5–7.</ns0:t>
+              <ns0:t>Input vector for Tests 5–8.</ns0:t>
             </ns0:r>
           </ns0:p>
         </ns0:tc>
@@ -1184,6 +1184,294 @@
                 <ns0:szCs ns0:val="19"/>
               </ns0:rPr>
               <ns0:t>Six lines for kernel row 0, with no header or separators. Each line corresponds to one mask value, following the order in COMPUTE_MASK_VALS, and contains one pre-clipping 32-bit PSOUT value written as eight hexadecimal digits. Negative values use two’s-complement representation.</ns0:t>
+            </ns0:r>
+          </ns0:p>
+        </ns0:tc>
+      </ns0:tr>
+      <ns0:tr>
+        <ns0:tc>
+          <ns0:tcPr>
+            <ns0:tcW ns0:type="dxa" ns0:w="3200"/>
+            <ns0:noWrap/>
+          </ns0:tcPr>
+          <ns0:p>
+            <ns0:r>
+              <ns0:rPr>
+                <ns0:rFonts ns0:ascii="Times New Roman" ns0:hAnsi="Times New Roman"/>
+                <ns0:sz ns0:val="19"/>
+                <ns0:szCs ns0:val="19"/>
+              </ns0:rPr>
+              <ns0:t>golden_sign_01_clipped_8bit.txt</ns0:t>
+            </ns0:r>
+          </ns0:p>
+        </ns0:tc>
+        <ns0:tc>
+          <ns0:tcPr>
+            <ns0:tcW ns0:type="dxa" ns0:w="2200"/>
+          </ns0:tcPr>
+          <ns0:p>
+            <ns0:r>
+              <ns0:rPr>
+                <ns0:rFonts ns0:ascii="Times New Roman" ns0:hAnsi="Times New Roman"/>
+                <ns0:sz ns0:val="19"/>
+                <ns0:szCs ns0:val="19"/>
+              </ns0:rPr>
+              <ns0:t>Expected SOUT values for Test 8, sign_8b=01.</ns0:t>
+            </ns0:r>
+          </ns0:p>
+        </ns0:tc>
+        <ns0:tc>
+          <ns0:tcPr>
+            <ns0:tcW ns0:type="dxa" ns0:w="4100"/>
+          </ns0:tcPr>
+          <ns0:p>
+            <ns0:r>
+              <ns0:rPr>
+                <ns0:rFonts ns0:ascii="Times New Roman" ns0:hAnsi="Times New Roman"/>
+                <ns0:sz ns0:val="19"/>
+                <ns0:szCs ns0:val="19"/>
+              </ns0:rPr>
+              <ns0:t>32 lines ordered by kernel row 0–31, with no header or separators. Each line is one clipped 8-bit SOUT value written as two hexadecimal digits.</ns0:t>
+            </ns0:r>
+          </ns0:p>
+        </ns0:tc>
+      </ns0:tr>
+      <ns0:tr>
+        <ns0:tc>
+          <ns0:tcPr>
+            <ns0:tcW ns0:type="dxa" ns0:w="3200"/>
+            <ns0:noWrap/>
+          </ns0:tcPr>
+          <ns0:p>
+            <ns0:r>
+              <ns0:rPr>
+                <ns0:rFonts ns0:ascii="Times New Roman" ns0:hAnsi="Times New Roman"/>
+                <ns0:sz ns0:val="19"/>
+                <ns0:szCs ns0:val="19"/>
+              </ns0:rPr>
+              <ns0:t>golden_sign_01_psum_32bit.txt</ns0:t>
+            </ns0:r>
+          </ns0:p>
+        </ns0:tc>
+        <ns0:tc>
+          <ns0:tcPr>
+            <ns0:tcW ns0:type="dxa" ns0:w="2200"/>
+          </ns0:tcPr>
+          <ns0:p>
+            <ns0:r>
+              <ns0:rPr>
+                <ns0:rFonts ns0:ascii="Times New Roman" ns0:hAnsi="Times New Roman"/>
+                <ns0:sz ns0:val="19"/>
+                <ns0:szCs ns0:val="19"/>
+              </ns0:rPr>
+              <ns0:t>Expected PSOUT values for Test 8, sign_8b=01.</ns0:t>
+            </ns0:r>
+          </ns0:p>
+        </ns0:tc>
+        <ns0:tc>
+          <ns0:tcPr>
+            <ns0:tcW ns0:type="dxa" ns0:w="4100"/>
+          </ns0:tcPr>
+          <ns0:p>
+            <ns0:r>
+              <ns0:rPr>
+                <ns0:rFonts ns0:ascii="Times New Roman" ns0:hAnsi="Times New Roman"/>
+                <ns0:sz ns0:val="19"/>
+                <ns0:szCs ns0:val="19"/>
+              </ns0:rPr>
+              <ns0:t>32 lines ordered by kernel row 0–31, with no header or separators. Each line is one pre-clipping 32-bit PSOUT value written as eight hexadecimal digits. Negative values use two’s-complement representation.</ns0:t>
+            </ns0:r>
+          </ns0:p>
+        </ns0:tc>
+      </ns0:tr>
+      <ns0:tr>
+        <ns0:tc>
+          <ns0:tcPr>
+            <ns0:tcW ns0:type="dxa" ns0:w="3200"/>
+            <ns0:noWrap/>
+          </ns0:tcPr>
+          <ns0:p>
+            <ns0:r>
+              <ns0:rPr>
+                <ns0:rFonts ns0:ascii="Times New Roman" ns0:hAnsi="Times New Roman"/>
+                <ns0:sz ns0:val="19"/>
+                <ns0:szCs ns0:val="19"/>
+              </ns0:rPr>
+              <ns0:t>golden_sign_10_clipped_8bit.txt</ns0:t>
+            </ns0:r>
+          </ns0:p>
+        </ns0:tc>
+        <ns0:tc>
+          <ns0:tcPr>
+            <ns0:tcW ns0:type="dxa" ns0:w="2200"/>
+          </ns0:tcPr>
+          <ns0:p>
+            <ns0:r>
+              <ns0:rPr>
+                <ns0:rFonts ns0:ascii="Times New Roman" ns0:hAnsi="Times New Roman"/>
+                <ns0:sz ns0:val="19"/>
+                <ns0:szCs ns0:val="19"/>
+              </ns0:rPr>
+              <ns0:t>Expected SOUT values for Test 8, sign_8b=10.</ns0:t>
+            </ns0:r>
+          </ns0:p>
+        </ns0:tc>
+        <ns0:tc>
+          <ns0:tcPr>
+            <ns0:tcW ns0:type="dxa" ns0:w="4100"/>
+          </ns0:tcPr>
+          <ns0:p>
+            <ns0:r>
+              <ns0:rPr>
+                <ns0:rFonts ns0:ascii="Times New Roman" ns0:hAnsi="Times New Roman"/>
+                <ns0:sz ns0:val="19"/>
+                <ns0:szCs ns0:val="19"/>
+              </ns0:rPr>
+              <ns0:t>32 lines ordered by kernel row 0–31, with no header or separators. Each line is one clipped 8-bit SOUT value written as two hexadecimal digits.</ns0:t>
+            </ns0:r>
+          </ns0:p>
+        </ns0:tc>
+      </ns0:tr>
+      <ns0:tr>
+        <ns0:tc>
+          <ns0:tcPr>
+            <ns0:tcW ns0:type="dxa" ns0:w="3200"/>
+            <ns0:noWrap/>
+          </ns0:tcPr>
+          <ns0:p>
+            <ns0:r>
+              <ns0:rPr>
+                <ns0:rFonts ns0:ascii="Times New Roman" ns0:hAnsi="Times New Roman"/>
+                <ns0:sz ns0:val="19"/>
+                <ns0:szCs ns0:val="19"/>
+              </ns0:rPr>
+              <ns0:t>golden_sign_10_psum_32bit.txt</ns0:t>
+            </ns0:r>
+          </ns0:p>
+        </ns0:tc>
+        <ns0:tc>
+          <ns0:tcPr>
+            <ns0:tcW ns0:type="dxa" ns0:w="2200"/>
+          </ns0:tcPr>
+          <ns0:p>
+            <ns0:r>
+              <ns0:rPr>
+                <ns0:rFonts ns0:ascii="Times New Roman" ns0:hAnsi="Times New Roman"/>
+                <ns0:sz ns0:val="19"/>
+                <ns0:szCs ns0:val="19"/>
+              </ns0:rPr>
+              <ns0:t>Expected PSOUT values for Test 8, sign_8b=10.</ns0:t>
+            </ns0:r>
+          </ns0:p>
+        </ns0:tc>
+        <ns0:tc>
+          <ns0:tcPr>
+            <ns0:tcW ns0:type="dxa" ns0:w="4100"/>
+          </ns0:tcPr>
+          <ns0:p>
+            <ns0:r>
+              <ns0:rPr>
+                <ns0:rFonts ns0:ascii="Times New Roman" ns0:hAnsi="Times New Roman"/>
+                <ns0:sz ns0:val="19"/>
+                <ns0:szCs ns0:val="19"/>
+              </ns0:rPr>
+              <ns0:t>32 lines ordered by kernel row 0–31, with no header or separators. Each line is one pre-clipping 32-bit PSOUT value written as eight hexadecimal digits. Negative values use two’s-complement representation.</ns0:t>
+            </ns0:r>
+          </ns0:p>
+        </ns0:tc>
+      </ns0:tr>
+      <ns0:tr>
+        <ns0:tc>
+          <ns0:tcPr>
+            <ns0:tcW ns0:type="dxa" ns0:w="3200"/>
+            <ns0:noWrap/>
+          </ns0:tcPr>
+          <ns0:p>
+            <ns0:r>
+              <ns0:rPr>
+                <ns0:rFonts ns0:ascii="Times New Roman" ns0:hAnsi="Times New Roman"/>
+                <ns0:sz ns0:val="19"/>
+                <ns0:szCs ns0:val="19"/>
+              </ns0:rPr>
+              <ns0:t>golden_sign_11_clipped_8bit.txt</ns0:t>
+            </ns0:r>
+          </ns0:p>
+        </ns0:tc>
+        <ns0:tc>
+          <ns0:tcPr>
+            <ns0:tcW ns0:type="dxa" ns0:w="2200"/>
+          </ns0:tcPr>
+          <ns0:p>
+            <ns0:r>
+              <ns0:rPr>
+                <ns0:rFonts ns0:ascii="Times New Roman" ns0:hAnsi="Times New Roman"/>
+                <ns0:sz ns0:val="19"/>
+                <ns0:szCs ns0:val="19"/>
+              </ns0:rPr>
+              <ns0:t>Expected SOUT values for Test 8, sign_8b=11.</ns0:t>
+            </ns0:r>
+          </ns0:p>
+        </ns0:tc>
+        <ns0:tc>
+          <ns0:tcPr>
+            <ns0:tcW ns0:type="dxa" ns0:w="4100"/>
+          </ns0:tcPr>
+          <ns0:p>
+            <ns0:r>
+              <ns0:rPr>
+                <ns0:rFonts ns0:ascii="Times New Roman" ns0:hAnsi="Times New Roman"/>
+                <ns0:sz ns0:val="19"/>
+                <ns0:szCs ns0:val="19"/>
+              </ns0:rPr>
+              <ns0:t>32 lines ordered by kernel row 0–31, with no header or separators. Each line is one clipped 8-bit SOUT value written as two hexadecimal digits.</ns0:t>
+            </ns0:r>
+          </ns0:p>
+        </ns0:tc>
+      </ns0:tr>
+      <ns0:tr>
+        <ns0:tc>
+          <ns0:tcPr>
+            <ns0:tcW ns0:type="dxa" ns0:w="3200"/>
+            <ns0:noWrap/>
+          </ns0:tcPr>
+          <ns0:p>
+            <ns0:r>
+              <ns0:rPr>
+                <ns0:rFonts ns0:ascii="Times New Roman" ns0:hAnsi="Times New Roman"/>
+                <ns0:sz ns0:val="19"/>
+                <ns0:szCs ns0:val="19"/>
+              </ns0:rPr>
+              <ns0:t>golden_sign_11_psum_32bit.txt</ns0:t>
+            </ns0:r>
+          </ns0:p>
+        </ns0:tc>
+        <ns0:tc>
+          <ns0:tcPr>
+            <ns0:tcW ns0:type="dxa" ns0:w="2200"/>
+          </ns0:tcPr>
+          <ns0:p>
+            <ns0:r>
+              <ns0:rPr>
+                <ns0:rFonts ns0:ascii="Times New Roman" ns0:hAnsi="Times New Roman"/>
+                <ns0:sz ns0:val="19"/>
+                <ns0:szCs ns0:val="19"/>
+              </ns0:rPr>
+              <ns0:t>Expected PSOUT values for Test 8, sign_8b=11.</ns0:t>
+            </ns0:r>
+          </ns0:p>
+        </ns0:tc>
+        <ns0:tc>
+          <ns0:tcPr>
+            <ns0:tcW ns0:type="dxa" ns0:w="4100"/>
+          </ns0:tcPr>
+          <ns0:p>
+            <ns0:r>
+              <ns0:rPr>
+                <ns0:rFonts ns0:ascii="Times New Roman" ns0:hAnsi="Times New Roman"/>
+                <ns0:sz ns0:val="19"/>
+                <ns0:szCs ns0:val="19"/>
+              </ns0:rPr>
+              <ns0:t>32 lines ordered by kernel row 0–31, with no header or separators. Each line is one pre-clipping 32-bit PSOUT value written as eight hexadecimal digits. Negative values use two’s-complement representation.</ns0:t>
             </ns0:r>
           </ns0:p>
         </ns0:tc>
@@ -1214,6 +1502,9 @@
     <ns0:p>
       <ns0:pPr>
         <ns0:pStyle ns0:val="Heading4"/>
+        <ns0:spacing ns0:after="100" ns0:before="240"/>
+        <ns0:shd ns0:fill="D9EAF7"/>
+        <ns0:keepNext/>
       </ns0:pPr>
       <ns0:r>
         <ns0:t>Test 1 — Reset Verification</ns0:t>
@@ -1255,6 +1546,9 @@
     <ns0:p>
       <ns0:pPr>
         <ns0:pStyle ns0:val="Heading4"/>
+        <ns0:spacing ns0:after="100" ns0:before="240"/>
+        <ns0:shd ns0:fill="D9EAF7"/>
+        <ns0:keepNext/>
       </ns0:pPr>
       <ns0:r>
         <ns0:t>Test 2 — Kernel Write + Read-Back</ns0:t>
@@ -1296,6 +1590,9 @@
     <ns0:p>
       <ns0:pPr>
         <ns0:pStyle ns0:val="Heading4"/>
+        <ns0:spacing ns0:after="100" ns0:before="240"/>
+        <ns0:shd ns0:fill="D9EAF7"/>
+        <ns0:keepNext/>
       </ns0:pPr>
       <ns0:r>
         <ns0:t>Test 3 — Optimized Kernel Write + Read-Back</ns0:t>
@@ -1337,6 +1634,9 @@
     <ns0:p>
       <ns0:pPr>
         <ns0:pStyle ns0:val="Heading4"/>
+        <ns0:spacing ns0:after="100" ns0:before="240"/>
+        <ns0:shd ns0:fill="D9EAF7"/>
+        <ns0:keepNext/>
       </ns0:pPr>
       <ns0:r>
         <ns0:t>Test 4 — Concurrent Dual-Port Read + Write</ns0:t>
@@ -1378,6 +1678,9 @@
     <ns0:p>
       <ns0:pPr>
         <ns0:pStyle ns0:val="Heading4"/>
+        <ns0:spacing ns0:after="100" ns0:before="240"/>
+        <ns0:shd ns0:fill="D9EAF7"/>
+        <ns0:keepNext/>
       </ns0:pPr>
       <ns0:r>
         <ns0:t>Test 5 — Full Matrix–Vector Multiplication (32 Rows)</ns0:t>
@@ -1407,6 +1710,9 @@
     <ns0:p>
       <ns0:pPr>
         <ns0:pStyle ns0:val="Heading4"/>
+        <ns0:spacing ns0:after="100" ns0:before="240"/>
+        <ns0:shd ns0:fill="D9EAF7"/>
+        <ns0:keepNext/>
       </ns0:pPr>
       <ns0:r>
         <ns0:t>Test 6 — Pipelined Full Matrix–Vector Multiplication (32 Rows)</ns0:t>
@@ -1448,6 +1754,9 @@
     <ns0:p>
       <ns0:pPr>
         <ns0:pStyle ns0:val="Heading4"/>
+        <ns0:spacing ns0:after="100" ns0:before="240"/>
+        <ns0:shd ns0:fill="D9EAF7"/>
+        <ns0:keepNext/>
       </ns0:pPr>
       <ns0:r>
         <ns0:t>Test 7 — compute_mask Masking Sweep</ns0:t>
@@ -1488,6 +1797,50 @@
     </ns0:p>
     <ns0:p>
       <ns0:pPr>
+        <ns0:pStyle ns0:val="Heading4"/>
+        <ns0:spacing ns0:after="100" ns0:before="240"/>
+        <ns0:shd ns0:fill="D9EAF7"/>
+        <ns0:keepNext/>
+      </ns0:pPr>
+      <ns0:r>
+        <ns0:t>Test 8 — Signed 8-Bit Multiplication</ns0:t>
+      </ns0:r>
+    </ns0:p>
+    <ns0:p>
+      <ns0:r>
+        <ns0:rPr>
+          <ns0:b/>
+        </ns0:rPr>
+        <ns0:t xml:space="preserve">Purpose: </ns0:t>
+      </ns0:r>
+      <ns0:r>
+        <ns0:t>Compute all 32 rows for sign_8b=01, 10, and 11, then compare PSOUT and SOUT with mode-specific golden values.</ns0:t>
+      </ns0:r>
+    </ns0:p>
+    <ns0:p>
+      <ns0:r>
+        <ns0:rPr>
+          <ns0:b/>
+        </ns0:rPr>
+        <ns0:t xml:space="preserve">Stimulus/golden files: </ns0:t>
+      </ns0:r>
+      <ns0:r>
+        <ns0:t>kernel_weights.txt, feature_vector.txt, and the six golden_sign_01, golden_sign_10, and golden_sign_11 PSOUT/SOUT files.</ns0:t>
+      </ns0:r>
+    </ns0:p>
+    <ns0:p>
+      <ns0:r>
+        <ns0:rPr>
+          <ns0:b/>
+        </ns0:rPr>
+        <ns0:t xml:space="preserve">Generator: </ns0:t>
+      </ns0:r>
+      <ns0:r>
+        <ns0:t>stimuli/spatz_dimc_stim.py.</ns0:t>
+      </ns0:r>
+    </ns0:p>
+    <ns0:p>
+      <ns0:pPr>
         <ns0:pStyle ns0:val="Heading3"/>
       </ns0:pPr>
       <ns0:r>
@@ -1499,7 +1852,7 @@
         <ns0:ind ns0:hanging="240" ns0:left="480"/>
       </ns0:pPr>
       <ns0:r>
-        <ns0:t>• Tests cover only SECTION_WIDTH=256, MODE=11, and sign_8b=00; other implemented modes and signed configurations are not verified.</ns0:t>
+        <ns0:t>• Tests cover only SECTION_WIDTH=256 and MODE=11.</ns0:t>
       </ns0:r>
     </ns0:p>
     <ns0:p>
@@ -1507,7 +1860,7 @@
         <ns0:ind ns0:hanging="240" ns0:left="480"/>
       </ns0:pPr>
       <ns0:r>
-        <ns0:t>• All six data files are loaded unconditionally, even when their associated tests are disabled.</ns0:t>
+        <ns0:t>• All twelve data files are loaded unconditionally, even when their associated tests are disabled.</ns0:t>
       </ns0:r>
     </ns0:p>
     <ns0:p>
@@ -1653,7 +2006,7 @@
                 <ns0:sz ns0:val="19"/>
                 <ns0:szCs ns0:val="19"/>
               </ns0:rPr>
-              <ns0:t>−2,080,000</ns0:t>
+              <ns0:t>0</ns0:t>
             </ns0:r>
           </ns0:p>
         </ns0:tc>
@@ -1863,6 +2216,54 @@
                 <ns0:szCs ns0:val="19"/>
               </ns0:rPr>
               <ns0:t>Selects the output directory.</ns0:t>
+            </ns0:r>
+          </ns0:p>
+        </ns0:tc>
+      </ns0:tr>
+      <ns0:tr>
+        <ns0:tc>
+          <ns0:tcPr>
+            <ns0:tcW ns0:type="dxa" ns0:w="2500"/>
+            <ns0:noWrap/>
+          </ns0:tcPr>
+          <ns0:p>
+            <ns0:r>
+              <ns0:rPr>
+                <ns0:rFonts ns0:ascii="Times New Roman" ns0:hAnsi="Times New Roman"/>
+                <ns0:sz ns0:val="19"/>
+                <ns0:szCs ns0:val="19"/>
+              </ns0:rPr>
+              <ns0:t>SIGNED_8B_MODES</ns0:t>
+            </ns0:r>
+          </ns0:p>
+        </ns0:tc>
+        <ns0:tc>
+          <ns0:tcPr>
+            <ns0:tcW ns0:type="dxa" ns0:w="2700"/>
+          </ns0:tcPr>
+          <ns0:p>
+            <ns0:r>
+              <ns0:rPr>
+                <ns0:rFonts ns0:ascii="Times New Roman" ns0:hAnsi="Times New Roman"/>
+                <ns0:sz ns0:val="19"/>
+                <ns0:szCs ns0:val="19"/>
+              </ns0:rPr>
+              <ns0:t>01, 10, 11</ns0:t>
+            </ns0:r>
+          </ns0:p>
+        </ns0:tc>
+        <ns0:tc>
+          <ns0:tcPr>
+            <ns0:tcW ns0:type="dxa" ns0:w="4400"/>
+          </ns0:tcPr>
+          <ns0:p>
+            <ns0:r>
+              <ns0:rPr>
+                <ns0:rFonts ns0:ascii="Times New Roman" ns0:hAnsi="Times New Roman"/>
+                <ns0:sz ns0:val="19"/>
+                <ns0:szCs ns0:val="19"/>
+              </ns0:rPr>
+              <ns0:t>Selects the signed 8-bit modes for which Test 8 golden files are generated.</ns0:t>
             </ns0:r>
           </ns0:p>
         </ns0:tc>
@@ -2035,7 +2436,7 @@
                 <ns0:sz ns0:val="19"/>
                 <ns0:szCs ns0:val="19"/>
               </ns0:rPr>
-              <ns0:t>32 expected 8-bit SOUT values after bias, ReLU, and clipping.</ns0:t>
+              <ns0:t>32 lines ordered by kernel row 0–31, with no header or separators. Each line contains one clipped 8-bit SOUT value written as two hexadecimal digits.</ns0:t>
             </ns0:r>
           </ns0:p>
         </ns0:tc>
@@ -2068,7 +2469,7 @@
                 <ns0:sz ns0:val="19"/>
                 <ns0:szCs ns0:val="19"/>
               </ns0:rPr>
-              <ns0:t>32 expected 32-bit PSOUT values after adding the bias and before clipping.</ns0:t>
+              <ns0:t>32 lines ordered by kernel row 0–31, with no header or separators. Each line contains one pre-clipping 32-bit PSOUT value written as eight hexadecimal digits.</ns0:t>
             </ns0:r>
           </ns0:p>
         </ns0:tc>
@@ -2101,7 +2502,7 @@
                 <ns0:sz ns0:val="19"/>
                 <ns0:szCs ns0:val="19"/>
               </ns0:rPr>
-              <ns0:t>Six expected 8-bit SOUT values for the Test 7 mask sweep on kernel row 0.</ns0:t>
+              <ns0:t>Six lines for kernel row 0, with no header or separators. Lines follow COMPUTE_MASK_VALS order; each contains one clipped 8-bit SOUT value written as two hexadecimal digits.</ns0:t>
             </ns0:r>
           </ns0:p>
         </ns0:tc>
@@ -2134,7 +2535,205 @@
                 <ns0:sz ns0:val="19"/>
                 <ns0:szCs ns0:val="19"/>
               </ns0:rPr>
-              <ns0:t>Six expected 32-bit PSOUT values for the Test 7 mask sweep on kernel row 0, before clipping.</ns0:t>
+              <ns0:t>Six lines for kernel row 0, with no header or separators. Lines follow COMPUTE_MASK_VALS order; each contains one pre-clipping 32-bit PSOUT value written as eight hexadecimal digits. Negative values use two’s-complement representation.</ns0:t>
+            </ns0:r>
+          </ns0:p>
+        </ns0:tc>
+      </ns0:tr>
+      <ns0:tr>
+        <ns0:tc>
+          <ns0:tcPr>
+            <ns0:tcW ns0:type="dxa" ns0:w="5000"/>
+            <ns0:noWrap/>
+          </ns0:tcPr>
+          <ns0:p>
+            <ns0:r>
+              <ns0:rPr>
+                <ns0:rFonts ns0:ascii="Times New Roman" ns0:hAnsi="Times New Roman"/>
+                <ns0:sz ns0:val="19"/>
+                <ns0:szCs ns0:val="19"/>
+              </ns0:rPr>
+              <ns0:t>golden_sign_01_clipped_8bit.txt</ns0:t>
+            </ns0:r>
+          </ns0:p>
+        </ns0:tc>
+        <ns0:tc>
+          <ns0:tcPr>
+            <ns0:tcW ns0:type="dxa" ns0:w="4600"/>
+          </ns0:tcPr>
+          <ns0:p>
+            <ns0:r>
+              <ns0:rPr>
+                <ns0:rFonts ns0:ascii="Times New Roman" ns0:hAnsi="Times New Roman"/>
+                <ns0:sz ns0:val="19"/>
+                <ns0:szCs ns0:val="19"/>
+              </ns0:rPr>
+              <ns0:t>32 lines ordered by kernel row 0–31 for signed-kernel, unsigned-feature multiplication, with no header or separators. Each line contains one clipped 8-bit SOUT value written as two hexadecimal digits.</ns0:t>
+            </ns0:r>
+          </ns0:p>
+        </ns0:tc>
+      </ns0:tr>
+      <ns0:tr>
+        <ns0:tc>
+          <ns0:tcPr>
+            <ns0:tcW ns0:type="dxa" ns0:w="5000"/>
+            <ns0:noWrap/>
+          </ns0:tcPr>
+          <ns0:p>
+            <ns0:r>
+              <ns0:rPr>
+                <ns0:rFonts ns0:ascii="Times New Roman" ns0:hAnsi="Times New Roman"/>
+                <ns0:sz ns0:val="19"/>
+                <ns0:szCs ns0:val="19"/>
+              </ns0:rPr>
+              <ns0:t>golden_sign_01_psum_32bit.txt</ns0:t>
+            </ns0:r>
+          </ns0:p>
+        </ns0:tc>
+        <ns0:tc>
+          <ns0:tcPr>
+            <ns0:tcW ns0:type="dxa" ns0:w="4600"/>
+          </ns0:tcPr>
+          <ns0:p>
+            <ns0:r>
+              <ns0:rPr>
+                <ns0:rFonts ns0:ascii="Times New Roman" ns0:hAnsi="Times New Roman"/>
+                <ns0:sz ns0:val="19"/>
+                <ns0:szCs ns0:val="19"/>
+              </ns0:rPr>
+              <ns0:t>32 lines ordered by kernel row 0–31 for signed-kernel, unsigned-feature multiplication, with no header or separators. Each line contains one pre-clipping 32-bit PSOUT value written as eight hexadecimal digits. Negative values use two’s-complement representation.</ns0:t>
+            </ns0:r>
+          </ns0:p>
+        </ns0:tc>
+      </ns0:tr>
+      <ns0:tr>
+        <ns0:tc>
+          <ns0:tcPr>
+            <ns0:tcW ns0:type="dxa" ns0:w="5000"/>
+            <ns0:noWrap/>
+          </ns0:tcPr>
+          <ns0:p>
+            <ns0:r>
+              <ns0:rPr>
+                <ns0:rFonts ns0:ascii="Times New Roman" ns0:hAnsi="Times New Roman"/>
+                <ns0:sz ns0:val="19"/>
+                <ns0:szCs ns0:val="19"/>
+              </ns0:rPr>
+              <ns0:t>golden_sign_10_clipped_8bit.txt</ns0:t>
+            </ns0:r>
+          </ns0:p>
+        </ns0:tc>
+        <ns0:tc>
+          <ns0:tcPr>
+            <ns0:tcW ns0:type="dxa" ns0:w="4600"/>
+          </ns0:tcPr>
+          <ns0:p>
+            <ns0:r>
+              <ns0:rPr>
+                <ns0:rFonts ns0:ascii="Times New Roman" ns0:hAnsi="Times New Roman"/>
+                <ns0:sz ns0:val="19"/>
+                <ns0:szCs ns0:val="19"/>
+              </ns0:rPr>
+              <ns0:t>32 lines ordered by kernel row 0–31 for unsigned-kernel, signed-feature multiplication, with no header or separators. Each line contains one clipped 8-bit SOUT value written as two hexadecimal digits.</ns0:t>
+            </ns0:r>
+          </ns0:p>
+        </ns0:tc>
+      </ns0:tr>
+      <ns0:tr>
+        <ns0:tc>
+          <ns0:tcPr>
+            <ns0:tcW ns0:type="dxa" ns0:w="5000"/>
+            <ns0:noWrap/>
+          </ns0:tcPr>
+          <ns0:p>
+            <ns0:r>
+              <ns0:rPr>
+                <ns0:rFonts ns0:ascii="Times New Roman" ns0:hAnsi="Times New Roman"/>
+                <ns0:sz ns0:val="19"/>
+                <ns0:szCs ns0:val="19"/>
+              </ns0:rPr>
+              <ns0:t>golden_sign_10_psum_32bit.txt</ns0:t>
+            </ns0:r>
+          </ns0:p>
+        </ns0:tc>
+        <ns0:tc>
+          <ns0:tcPr>
+            <ns0:tcW ns0:type="dxa" ns0:w="4600"/>
+          </ns0:tcPr>
+          <ns0:p>
+            <ns0:r>
+              <ns0:rPr>
+                <ns0:rFonts ns0:ascii="Times New Roman" ns0:hAnsi="Times New Roman"/>
+                <ns0:sz ns0:val="19"/>
+                <ns0:szCs ns0:val="19"/>
+              </ns0:rPr>
+              <ns0:t>32 lines ordered by kernel row 0–31 for unsigned-kernel, signed-feature multiplication, with no header or separators. Each line contains one pre-clipping 32-bit PSOUT value written as eight hexadecimal digits. Negative values use two’s-complement representation.</ns0:t>
+            </ns0:r>
+          </ns0:p>
+        </ns0:tc>
+      </ns0:tr>
+      <ns0:tr>
+        <ns0:tc>
+          <ns0:tcPr>
+            <ns0:tcW ns0:type="dxa" ns0:w="5000"/>
+            <ns0:noWrap/>
+          </ns0:tcPr>
+          <ns0:p>
+            <ns0:r>
+              <ns0:rPr>
+                <ns0:rFonts ns0:ascii="Times New Roman" ns0:hAnsi="Times New Roman"/>
+                <ns0:sz ns0:val="19"/>
+                <ns0:szCs ns0:val="19"/>
+              </ns0:rPr>
+              <ns0:t>golden_sign_11_clipped_8bit.txt</ns0:t>
+            </ns0:r>
+          </ns0:p>
+        </ns0:tc>
+        <ns0:tc>
+          <ns0:tcPr>
+            <ns0:tcW ns0:type="dxa" ns0:w="4600"/>
+          </ns0:tcPr>
+          <ns0:p>
+            <ns0:r>
+              <ns0:rPr>
+                <ns0:rFonts ns0:ascii="Times New Roman" ns0:hAnsi="Times New Roman"/>
+                <ns0:sz ns0:val="19"/>
+                <ns0:szCs ns0:val="19"/>
+              </ns0:rPr>
+              <ns0:t>32 lines ordered by kernel row 0–31 for signed-kernel, signed-feature multiplication, with no header or separators. Each line contains one clipped 8-bit SOUT value written as two hexadecimal digits.</ns0:t>
+            </ns0:r>
+          </ns0:p>
+        </ns0:tc>
+      </ns0:tr>
+      <ns0:tr>
+        <ns0:tc>
+          <ns0:tcPr>
+            <ns0:tcW ns0:type="dxa" ns0:w="5000"/>
+            <ns0:noWrap/>
+          </ns0:tcPr>
+          <ns0:p>
+            <ns0:r>
+              <ns0:rPr>
+                <ns0:rFonts ns0:ascii="Times New Roman" ns0:hAnsi="Times New Roman"/>
+                <ns0:sz ns0:val="19"/>
+                <ns0:szCs ns0:val="19"/>
+              </ns0:rPr>
+              <ns0:t>golden_sign_11_psum_32bit.txt</ns0:t>
+            </ns0:r>
+          </ns0:p>
+        </ns0:tc>
+        <ns0:tc>
+          <ns0:tcPr>
+            <ns0:tcW ns0:type="dxa" ns0:w="4600"/>
+          </ns0:tcPr>
+          <ns0:p>
+            <ns0:r>
+              <ns0:rPr>
+                <ns0:rFonts ns0:ascii="Times New Roman" ns0:hAnsi="Times New Roman"/>
+                <ns0:sz ns0:val="19"/>
+                <ns0:szCs ns0:val="19"/>
+              </ns0:rPr>
+              <ns0:t>32 lines ordered by kernel row 0–31 for signed-kernel, signed-feature multiplication, with no header or separators. Each line contains one pre-clipping 32-bit PSOUT value written as eight hexadecimal digits. Negative values use two’s-complement representation.</ns0:t>
             </ns0:r>
           </ns0:p>
         </ns0:tc>

</xml_diff>

<commit_message>
correct mistake in document
</commit_message>
<xml_diff>
--- a/docs/documentation.docx
+++ b/docs/documentation.docx
@@ -701,8 +701,17 @@
       </w:tr>
     </w:tbl>
     <w:p>
-      <w:r>
-        <w:t>The result becomes available at the output ports for sampling at N+5.</w:t>
+      <w:pPr>
+        <w:spacing w:after="80" w:line="278" w:lineRule="auto"/>
+      </w:pPr>
+      <w:r>
+        <w:rPr>
+          <w:rFonts w:ascii="Times New Roman" w:hAnsi="Times New Roman" w:cs="Arial" w:eastAsiaTheme="minorEastAsia" w:csTheme="minorBidi"/>
+          <w:kern w:val="2"/>
+          <w:sz w:val="21"/>
+          <w:szCs w:val="24"/>
+        </w:rPr>
+        <w:t>The result becomes available at the output ports for sampling at N+4.</w:t>
       </w:r>
     </w:p>
     <w:p>

</xml_diff>

<commit_message>
update dual dimc files and update its documentation
</commit_message>
<xml_diff>
--- a/docs/documentation.docx
+++ b/docs/documentation.docx
@@ -90,7 +90,7 @@
                 <w:sz w:val="19"/>
                 <w:szCs w:val="19"/>
               </w:rPr>
-              <w:t>Current setting</w:t>
+              <w:t>Allowed values</w:t>
             </w:r>
           </w:p>
         </w:tc>
@@ -151,7 +151,23 @@
                 <w:sz w:val="19"/>
                 <w:szCs w:val="19"/>
               </w:rPr>
-              <w:t>Sets the section size. A 1024-bit kernel row and feature vector contain 4, 2, or 1 sections respectively.</w:t>
+              <w:t xml:space="preserve">Sets the section size. A 1024-bit kernel row and feature vector contain 4, 2, or 1 </w:t>
+            </w:r>
+            <w:proofErr w:type="gramStart"/>
+            <w:r>
+              <w:rPr>
+                <w:sz w:val="19"/>
+                <w:szCs w:val="19"/>
+              </w:rPr>
+              <w:t>sections</w:t>
+            </w:r>
+            <w:proofErr w:type="gramEnd"/>
+            <w:r>
+              <w:rPr>
+                <w:sz w:val="19"/>
+                <w:szCs w:val="19"/>
+              </w:rPr>
+              <w:t xml:space="preserve"> respectively.</w:t>
             </w:r>
           </w:p>
         </w:tc>
@@ -504,21 +520,7 @@
                 <w:sz w:val="19"/>
                 <w:szCs w:val="19"/>
               </w:rPr>
-              <w:t>C</w:t>
-            </w:r>
-            <w:r>
-              <w:rPr>
-                <w:sz w:val="19"/>
-                <w:szCs w:val="19"/>
-              </w:rPr>
-              <w:t>omputation request</w:t>
-            </w:r>
-            <w:r>
-              <w:rPr>
-                <w:sz w:val="19"/>
-                <w:szCs w:val="19"/>
-              </w:rPr>
-              <w:t xml:space="preserve"> made.</w:t>
+              <w:t>Computation request made.</w:t>
             </w:r>
           </w:p>
         </w:tc>
@@ -701,15 +703,9 @@
       </w:tr>
     </w:tbl>
     <w:p>
-      <w:pPr>
-        <w:spacing w:after="80" w:line="278" w:lineRule="auto"/>
-      </w:pPr>
-      <w:r>
-        <w:rPr>
-          <w:rFonts w:ascii="Times New Roman" w:hAnsi="Times New Roman" w:cs="Arial" w:eastAsiaTheme="minorEastAsia" w:csTheme="minorBidi"/>
-          <w:kern w:val="2"/>
-          <w:sz w:val="21"/>
-          <w:szCs w:val="24"/>
+      <w:r>
+        <w:rPr>
+          <w:rFonts w:cs="Arial"/>
         </w:rPr>
         <w:t>The result becomes available at the output ports for sampling at N+4.</w:t>
       </w:r>
@@ -758,7 +754,7 @@
                     <pic:cNvPicPr/>
                   </pic:nvPicPr>
                   <pic:blipFill>
-                    <a:blip r:embed="rId5"/>
+                    <a:blip r:embed="rId6"/>
                     <a:stretch>
                       <a:fillRect/>
                     </a:stretch>
@@ -789,10 +785,964 @@
     </w:p>
     <w:p>
       <w:pPr>
-        <w:ind w:left="480" w:hanging="240"/>
-      </w:pPr>
-      <w:r>
-        <w:t>• Non-default SECTION_WIDTH values are not fully supported yet.</w:t>
+        <w:pStyle w:val="ListParagraph"/>
+        <w:numPr>
+          <w:ilvl w:val="0"/>
+          <w:numId w:val="3"/>
+        </w:numPr>
+      </w:pPr>
+      <w:r>
+        <w:t>Non-default SECTION_WIDTH values are not fully supported yet.</w:t>
+      </w:r>
+    </w:p>
+    <w:p>
+      <w:pPr>
+        <w:pStyle w:val="Heading2"/>
+      </w:pPr>
+      <w:r>
+        <w:t>spatz_dimc</w:t>
+      </w:r>
+      <w:r>
+        <w:t>_dual</w:t>
+      </w:r>
+      <w:r>
+        <w:t>.sv</w:t>
+      </w:r>
+    </w:p>
+    <w:p>
+      <w:pPr>
+        <w:pStyle w:val="Heading3"/>
+      </w:pPr>
+      <w:r>
+        <w:t xml:space="preserve">Structure </w:t>
+      </w:r>
+    </w:p>
+    <w:p>
+      <w:pPr>
+        <w:pStyle w:val="ListParagraph"/>
+        <w:numPr>
+          <w:ilvl w:val="0"/>
+          <w:numId w:val="3"/>
+        </w:numPr>
+      </w:pPr>
+      <w:r>
+        <w:t>3 FIFO buffers</w:t>
+      </w:r>
+    </w:p>
+    <w:p>
+      <w:pPr>
+        <w:pStyle w:val="ListParagraph"/>
+        <w:numPr>
+          <w:ilvl w:val="1"/>
+          <w:numId w:val="3"/>
+        </w:numPr>
+      </w:pPr>
+      <w:r>
+        <w:t xml:space="preserve">Input FIFO buffer </w:t>
+      </w:r>
+    </w:p>
+    <w:p>
+      <w:pPr>
+        <w:pStyle w:val="ListParagraph"/>
+        <w:numPr>
+          <w:ilvl w:val="1"/>
+          <w:numId w:val="3"/>
+        </w:numPr>
+      </w:pPr>
+      <w:r>
+        <w:t>Weight FIFO buffer</w:t>
+      </w:r>
+    </w:p>
+    <w:p>
+      <w:pPr>
+        <w:pStyle w:val="ListParagraph"/>
+        <w:numPr>
+          <w:ilvl w:val="1"/>
+          <w:numId w:val="3"/>
+        </w:numPr>
+      </w:pPr>
+      <w:r>
+        <w:t>Output FIFO buffer</w:t>
+      </w:r>
+    </w:p>
+    <w:p>
+      <w:pPr>
+        <w:pStyle w:val="ListParagraph"/>
+        <w:numPr>
+          <w:ilvl w:val="0"/>
+          <w:numId w:val="3"/>
+        </w:numPr>
+      </w:pPr>
+      <w:r>
+        <w:t>2 DIMC macros sharing input and weight FIFO buffers</w:t>
+      </w:r>
+    </w:p>
+    <w:p>
+      <w:pPr>
+        <w:pStyle w:val="ListParagraph"/>
+        <w:numPr>
+          <w:ilvl w:val="0"/>
+          <w:numId w:val="3"/>
+        </w:numPr>
+      </w:pPr>
+      <w:r>
+        <w:t>1 MUX that receives outputs of both DIMC macros and a select signal</w:t>
+      </w:r>
+      <w:r>
+        <w:t>.</w:t>
+      </w:r>
+    </w:p>
+    <w:p>
+      <w:pPr>
+        <w:pStyle w:val="ListParagraph"/>
+        <w:numPr>
+          <w:ilvl w:val="0"/>
+          <w:numId w:val="3"/>
+        </w:numPr>
+      </w:pPr>
+      <w:r>
+        <w:t xml:space="preserve">The select signal decides which macro has its output passed to the output FIFO buffer </w:t>
+      </w:r>
+    </w:p>
+    <w:p>
+      <w:pPr>
+        <w:ind w:left="360"/>
+        <w:jc w:val="center"/>
+      </w:pPr>
+      <w:r>
+        <w:drawing>
+          <wp:inline distT="0" distB="0" distL="0" distR="0" wp14:anchorId="4C4F2F16" wp14:editId="5CA51929">
+            <wp:extent cx="3669323" cy="3006500"/>
+            <wp:effectExtent l="0" t="0" r="0" b="0"/>
+            <wp:docPr id="264032575" name="Picture 1"/>
+            <wp:cNvGraphicFramePr>
+              <a:graphicFrameLocks xmlns:a="http://schemas.openxmlformats.org/drawingml/2006/main" noChangeAspect="1"/>
+            </wp:cNvGraphicFramePr>
+            <a:graphic xmlns:a="http://schemas.openxmlformats.org/drawingml/2006/main">
+              <a:graphicData uri="http://schemas.openxmlformats.org/drawingml/2006/picture">
+                <pic:pic xmlns:pic="http://schemas.openxmlformats.org/drawingml/2006/picture">
+                  <pic:nvPicPr>
+                    <pic:cNvPr id="264032575" name=""/>
+                    <pic:cNvPicPr/>
+                  </pic:nvPicPr>
+                  <pic:blipFill>
+                    <a:blip r:embed="rId7"/>
+                    <a:stretch>
+                      <a:fillRect/>
+                    </a:stretch>
+                  </pic:blipFill>
+                  <pic:spPr>
+                    <a:xfrm>
+                      <a:off x="0" y="0"/>
+                      <a:ext cx="3706538" cy="3036992"/>
+                    </a:xfrm>
+                    <a:prstGeom prst="rect">
+                      <a:avLst/>
+                    </a:prstGeom>
+                  </pic:spPr>
+                </pic:pic>
+              </a:graphicData>
+            </a:graphic>
+          </wp:inline>
+        </w:drawing>
+      </w:r>
+    </w:p>
+    <w:p>
+      <w:pPr>
+        <w:pStyle w:val="Heading3"/>
+      </w:pPr>
+      <w:r>
+        <w:lastRenderedPageBreak/>
+        <w:t>Configuration</w:t>
+      </w:r>
+    </w:p>
+    <w:tbl>
+      <w:tblPr>
+        <w:tblW w:w="0" w:type="auto"/>
+        <w:tblInd w:w="120" w:type="dxa"/>
+        <w:tblBorders>
+          <w:top w:val="single" w:sz="4" w:space="0" w:color="777777"/>
+          <w:left w:val="single" w:sz="4" w:space="0" w:color="777777"/>
+          <w:bottom w:val="single" w:sz="4" w:space="0" w:color="777777"/>
+          <w:right w:val="single" w:sz="4" w:space="0" w:color="777777"/>
+          <w:insideH w:val="single" w:sz="4" w:space="0" w:color="777777"/>
+          <w:insideV w:val="single" w:sz="4" w:space="0" w:color="777777"/>
+        </w:tblBorders>
+        <w:tblLayout w:type="fixed"/>
+        <w:tblCellMar>
+          <w:top w:w="120" w:type="dxa"/>
+          <w:left w:w="120" w:type="dxa"/>
+          <w:bottom w:w="120" w:type="dxa"/>
+          <w:right w:w="120" w:type="dxa"/>
+        </w:tblCellMar>
+        <w:tblLook w:val="0000" w:firstRow="0" w:lastRow="0" w:firstColumn="0" w:lastColumn="0" w:noHBand="0" w:noVBand="0"/>
+      </w:tblPr>
+      <w:tblGrid>
+        <w:gridCol w:w="2600"/>
+        <w:gridCol w:w="2200"/>
+        <w:gridCol w:w="4800"/>
+      </w:tblGrid>
+      <w:tr>
+        <w:tc>
+          <w:tcPr>
+            <w:tcW w:w="2600" w:type="dxa"/>
+            <w:shd w:val="clear" w:color="auto" w:fill="D9EAF7"/>
+            <w:noWrap/>
+          </w:tcPr>
+          <w:p>
+            <w:r>
+              <w:rPr>
+                <w:b/>
+                <w:sz w:val="19"/>
+                <w:szCs w:val="19"/>
+              </w:rPr>
+              <w:t>Parameter</w:t>
+            </w:r>
+          </w:p>
+        </w:tc>
+        <w:tc>
+          <w:tcPr>
+            <w:tcW w:w="2200" w:type="dxa"/>
+            <w:shd w:val="clear" w:color="auto" w:fill="D9EAF7"/>
+          </w:tcPr>
+          <w:p>
+            <w:r>
+              <w:rPr>
+                <w:b/>
+                <w:sz w:val="19"/>
+                <w:szCs w:val="19"/>
+              </w:rPr>
+              <w:t>Value</w:t>
+            </w:r>
+          </w:p>
+        </w:tc>
+        <w:tc>
+          <w:tcPr>
+            <w:tcW w:w="4800" w:type="dxa"/>
+            <w:shd w:val="clear" w:color="auto" w:fill="D9EAF7"/>
+          </w:tcPr>
+          <w:p>
+            <w:r>
+              <w:rPr>
+                <w:b/>
+                <w:sz w:val="19"/>
+                <w:szCs w:val="19"/>
+              </w:rPr>
+              <w:t>Description</w:t>
+            </w:r>
+          </w:p>
+        </w:tc>
+      </w:tr>
+      <w:tr>
+        <w:tc>
+          <w:tcPr>
+            <w:tcW w:w="2600" w:type="dxa"/>
+            <w:noWrap/>
+          </w:tcPr>
+          <w:p>
+            <w:r>
+              <w:rPr>
+                <w:sz w:val="19"/>
+                <w:szCs w:val="19"/>
+              </w:rPr>
+              <w:t>SECTION_WIDTH</w:t>
+            </w:r>
+          </w:p>
+        </w:tc>
+        <w:tc>
+          <w:tcPr>
+            <w:tcW w:w="2200" w:type="dxa"/>
+          </w:tcPr>
+          <w:p>
+            <w:r>
+              <w:rPr>
+                <w:sz w:val="19"/>
+                <w:szCs w:val="19"/>
+              </w:rPr>
+              <w:t>256, 512, or 1024 bits</w:t>
+            </w:r>
+          </w:p>
+        </w:tc>
+        <w:tc>
+          <w:tcPr>
+            <w:tcW w:w="4800" w:type="dxa"/>
+          </w:tcPr>
+          <w:p>
+            <w:r>
+              <w:rPr>
+                <w:sz w:val="19"/>
+                <w:szCs w:val="19"/>
+              </w:rPr>
+              <w:t xml:space="preserve">Sets the section size. A 1024-bit kernel row and feature vector contain 4, 2, or 1 </w:t>
+            </w:r>
+            <w:r>
+              <w:rPr>
+                <w:sz w:val="19"/>
+                <w:szCs w:val="19"/>
+              </w:rPr>
+              <w:t>section</w:t>
+            </w:r>
+            <w:r>
+              <w:rPr>
+                <w:sz w:val="19"/>
+                <w:szCs w:val="19"/>
+              </w:rPr>
+              <w:t xml:space="preserve"> respectively.</w:t>
+            </w:r>
+          </w:p>
+        </w:tc>
+      </w:tr>
+      <w:tr>
+        <w:tc>
+          <w:tcPr>
+            <w:tcW w:w="2600" w:type="dxa"/>
+            <w:noWrap/>
+          </w:tcPr>
+          <w:p>
+            <w:pPr>
+              <w:rPr>
+                <w:sz w:val="19"/>
+                <w:szCs w:val="19"/>
+              </w:rPr>
+            </w:pPr>
+            <w:r>
+              <w:rPr>
+                <w:sz w:val="19"/>
+                <w:szCs w:val="19"/>
+              </w:rPr>
+              <w:t>INP_FIFO_DEPTH</w:t>
+            </w:r>
+          </w:p>
+        </w:tc>
+        <w:tc>
+          <w:tcPr>
+            <w:tcW w:w="2200" w:type="dxa"/>
+          </w:tcPr>
+          <w:p>
+            <w:pPr>
+              <w:rPr>
+                <w:sz w:val="19"/>
+                <w:szCs w:val="19"/>
+              </w:rPr>
+            </w:pPr>
+            <w:r>
+              <w:rPr>
+                <w:sz w:val="19"/>
+                <w:szCs w:val="19"/>
+              </w:rPr>
+              <w:t>To be decided</w:t>
+            </w:r>
+          </w:p>
+        </w:tc>
+        <w:tc>
+          <w:tcPr>
+            <w:tcW w:w="4800" w:type="dxa"/>
+          </w:tcPr>
+          <w:p>
+            <w:pPr>
+              <w:rPr>
+                <w:sz w:val="19"/>
+                <w:szCs w:val="19"/>
+              </w:rPr>
+            </w:pPr>
+            <w:r>
+              <w:rPr>
+                <w:sz w:val="19"/>
+                <w:szCs w:val="19"/>
+              </w:rPr>
+              <w:t>Sets the depth of the input FIFO buffer</w:t>
+            </w:r>
+          </w:p>
+        </w:tc>
+      </w:tr>
+      <w:tr>
+        <w:tc>
+          <w:tcPr>
+            <w:tcW w:w="2600" w:type="dxa"/>
+            <w:noWrap/>
+          </w:tcPr>
+          <w:p>
+            <w:pPr>
+              <w:rPr>
+                <w:sz w:val="19"/>
+                <w:szCs w:val="19"/>
+              </w:rPr>
+            </w:pPr>
+            <w:r>
+              <w:rPr>
+                <w:sz w:val="19"/>
+                <w:szCs w:val="19"/>
+              </w:rPr>
+              <w:t>WGT_FIFO_DEPTH</w:t>
+            </w:r>
+          </w:p>
+        </w:tc>
+        <w:tc>
+          <w:tcPr>
+            <w:tcW w:w="2200" w:type="dxa"/>
+          </w:tcPr>
+          <w:p>
+            <w:pPr>
+              <w:rPr>
+                <w:sz w:val="19"/>
+                <w:szCs w:val="19"/>
+              </w:rPr>
+            </w:pPr>
+            <w:r>
+              <w:rPr>
+                <w:sz w:val="19"/>
+                <w:szCs w:val="19"/>
+              </w:rPr>
+              <w:t>To be decided</w:t>
+            </w:r>
+          </w:p>
+        </w:tc>
+        <w:tc>
+          <w:tcPr>
+            <w:tcW w:w="4800" w:type="dxa"/>
+          </w:tcPr>
+          <w:p>
+            <w:pPr>
+              <w:rPr>
+                <w:sz w:val="19"/>
+                <w:szCs w:val="19"/>
+              </w:rPr>
+            </w:pPr>
+            <w:r>
+              <w:rPr>
+                <w:sz w:val="19"/>
+                <w:szCs w:val="19"/>
+              </w:rPr>
+              <w:t xml:space="preserve">Sets the depth of the </w:t>
+            </w:r>
+            <w:r>
+              <w:rPr>
+                <w:sz w:val="19"/>
+                <w:szCs w:val="19"/>
+              </w:rPr>
+              <w:t>weight</w:t>
+            </w:r>
+            <w:r>
+              <w:rPr>
+                <w:sz w:val="19"/>
+                <w:szCs w:val="19"/>
+              </w:rPr>
+              <w:t xml:space="preserve"> FIFO buffer</w:t>
+            </w:r>
+          </w:p>
+        </w:tc>
+      </w:tr>
+      <w:tr>
+        <w:tc>
+          <w:tcPr>
+            <w:tcW w:w="2600" w:type="dxa"/>
+            <w:noWrap/>
+          </w:tcPr>
+          <w:p>
+            <w:pPr>
+              <w:rPr>
+                <w:sz w:val="19"/>
+                <w:szCs w:val="19"/>
+              </w:rPr>
+            </w:pPr>
+            <w:r>
+              <w:rPr>
+                <w:sz w:val="19"/>
+                <w:szCs w:val="19"/>
+              </w:rPr>
+              <w:t>OUT_FIFO_DEPTH</w:t>
+            </w:r>
+          </w:p>
+        </w:tc>
+        <w:tc>
+          <w:tcPr>
+            <w:tcW w:w="2200" w:type="dxa"/>
+          </w:tcPr>
+          <w:p>
+            <w:pPr>
+              <w:rPr>
+                <w:sz w:val="19"/>
+                <w:szCs w:val="19"/>
+              </w:rPr>
+            </w:pPr>
+            <w:r>
+              <w:rPr>
+                <w:sz w:val="19"/>
+                <w:szCs w:val="19"/>
+              </w:rPr>
+              <w:t>To be decided</w:t>
+            </w:r>
+          </w:p>
+        </w:tc>
+        <w:tc>
+          <w:tcPr>
+            <w:tcW w:w="4800" w:type="dxa"/>
+          </w:tcPr>
+          <w:p>
+            <w:pPr>
+              <w:rPr>
+                <w:sz w:val="19"/>
+                <w:szCs w:val="19"/>
+              </w:rPr>
+            </w:pPr>
+            <w:r>
+              <w:rPr>
+                <w:sz w:val="19"/>
+                <w:szCs w:val="19"/>
+              </w:rPr>
+              <w:t xml:space="preserve">Sets the depth of the </w:t>
+            </w:r>
+            <w:r>
+              <w:rPr>
+                <w:sz w:val="19"/>
+                <w:szCs w:val="19"/>
+              </w:rPr>
+              <w:t>output</w:t>
+            </w:r>
+            <w:r>
+              <w:rPr>
+                <w:sz w:val="19"/>
+                <w:szCs w:val="19"/>
+              </w:rPr>
+              <w:t xml:space="preserve"> FIFO buffer</w:t>
+            </w:r>
+          </w:p>
+        </w:tc>
+      </w:tr>
+    </w:tbl>
+    <w:p>
+      <w:pPr>
+        <w:pStyle w:val="Heading3"/>
+      </w:pPr>
+      <w:r>
+        <w:t>Internal Behavior</w:t>
+      </w:r>
+    </w:p>
+    <w:p>
+      <w:pPr>
+        <w:pStyle w:val="ListParagraph"/>
+        <w:numPr>
+          <w:ilvl w:val="0"/>
+          <w:numId w:val="4"/>
+        </w:numPr>
+      </w:pPr>
+      <w:r>
+        <w:t xml:space="preserve">Signals sharing </w:t>
+      </w:r>
+    </w:p>
+    <w:p>
+      <w:pPr>
+        <w:pStyle w:val="ListParagraph"/>
+        <w:numPr>
+          <w:ilvl w:val="1"/>
+          <w:numId w:val="4"/>
+        </w:numPr>
+      </w:pPr>
+      <w:r>
+        <w:t xml:space="preserve">Each macro has an independent set of control inputs. </w:t>
+      </w:r>
+    </w:p>
+    <w:p>
+      <w:pPr>
+        <w:pStyle w:val="ListParagraph"/>
+        <w:numPr>
+          <w:ilvl w:val="1"/>
+          <w:numId w:val="4"/>
+        </w:numPr>
+      </w:pPr>
+      <w:r>
+        <w:t xml:space="preserve">clk and </w:t>
+      </w:r>
+      <w:proofErr w:type="spellStart"/>
+      <w:r>
+        <w:t>rst_n</w:t>
+      </w:r>
+      <w:proofErr w:type="spellEnd"/>
+      <w:r>
+        <w:t xml:space="preserve"> are the only shared control signals. </w:t>
+      </w:r>
+    </w:p>
+    <w:p>
+      <w:pPr>
+        <w:pStyle w:val="ListParagraph"/>
+        <w:numPr>
+          <w:ilvl w:val="0"/>
+          <w:numId w:val="4"/>
+        </w:numPr>
+      </w:pPr>
+      <w:r>
+        <w:t xml:space="preserve">Sel signal </w:t>
+      </w:r>
+      <w:r>
+        <w:t>and MUX functionality</w:t>
+      </w:r>
+    </w:p>
+    <w:p>
+      <w:pPr>
+        <w:pStyle w:val="ListParagraph"/>
+        <w:numPr>
+          <w:ilvl w:val="1"/>
+          <w:numId w:val="4"/>
+        </w:numPr>
+      </w:pPr>
+      <w:r>
+        <w:t xml:space="preserve">It </w:t>
+      </w:r>
+      <w:r>
+        <w:t xml:space="preserve">does not gate </w:t>
+      </w:r>
+      <w:proofErr w:type="gramStart"/>
+      <w:r>
+        <w:t>commands</w:t>
+      </w:r>
+      <w:proofErr w:type="gramEnd"/>
+      <w:r>
+        <w:t>.</w:t>
+      </w:r>
+    </w:p>
+    <w:p>
+      <w:pPr>
+        <w:pStyle w:val="ListParagraph"/>
+        <w:numPr>
+          <w:ilvl w:val="1"/>
+          <w:numId w:val="4"/>
+        </w:numPr>
+      </w:pPr>
+      <w:r>
+        <w:t>D (kernel write data) is sent to both macros; each macro's independent WCSN/WEN controls whether it writes.</w:t>
+      </w:r>
+    </w:p>
+    <w:p>
+      <w:pPr>
+        <w:pStyle w:val="ListParagraph"/>
+        <w:numPr>
+          <w:ilvl w:val="1"/>
+          <w:numId w:val="4"/>
+        </w:numPr>
+      </w:pPr>
+      <w:r>
+        <w:t>FD (feature data) is sent to both macros; each macro's independent FCSN controls whether it loads.</w:t>
+      </w:r>
+    </w:p>
+    <w:p>
+      <w:pPr>
+        <w:pStyle w:val="ListParagraph"/>
+        <w:numPr>
+          <w:ilvl w:val="1"/>
+          <w:numId w:val="4"/>
+        </w:numPr>
+      </w:pPr>
+      <w:r>
+        <w:t xml:space="preserve">It </w:t>
+      </w:r>
+      <w:r>
+        <w:t>chooses the macro whose output</w:t>
+      </w:r>
+      <w:r>
+        <w:t xml:space="preserve"> (</w:t>
+      </w:r>
+      <w:r>
+        <w:t>PSOUT</w:t>
+      </w:r>
+      <w:r>
+        <w:t xml:space="preserve"> signal) is </w:t>
+      </w:r>
+      <w:r>
+        <w:t xml:space="preserve">forwarded to </w:t>
+      </w:r>
+      <w:r>
+        <w:t xml:space="preserve">the </w:t>
+      </w:r>
+      <w:r>
+        <w:t>output FIFO.</w:t>
+      </w:r>
+    </w:p>
+    <w:p>
+      <w:pPr>
+        <w:pStyle w:val="ListParagraph"/>
+        <w:numPr>
+          <w:ilvl w:val="0"/>
+          <w:numId w:val="4"/>
+        </w:numPr>
+      </w:pPr>
+      <w:r>
+        <w:t>FIFO</w:t>
+      </w:r>
+      <w:r>
+        <w:t>s</w:t>
+      </w:r>
+      <w:r>
+        <w:t xml:space="preserve"> auto management</w:t>
+      </w:r>
+      <w:r>
+        <w:t xml:space="preserve"> </w:t>
+      </w:r>
+    </w:p>
+    <w:p>
+      <w:pPr>
+        <w:pStyle w:val="ListParagraph"/>
+        <w:numPr>
+          <w:ilvl w:val="1"/>
+          <w:numId w:val="4"/>
+        </w:numPr>
+      </w:pPr>
+      <w:r>
+        <w:t xml:space="preserve">FIFO pop and push signals are handled through </w:t>
+      </w:r>
+      <w:r>
+        <w:t>combinational</w:t>
+      </w:r>
+      <w:r>
+        <w:t xml:space="preserve"> logic.</w:t>
+      </w:r>
+    </w:p>
+    <w:p>
+      <w:pPr>
+        <w:pStyle w:val="ListParagraph"/>
+        <w:numPr>
+          <w:ilvl w:val="1"/>
+          <w:numId w:val="4"/>
+        </w:numPr>
+      </w:pPr>
+      <w:r>
+        <w:t>wgt_pop fires when</w:t>
+      </w:r>
+      <w:r>
+        <w:t xml:space="preserve"> either</w:t>
+      </w:r>
+      <w:r>
+        <w:t xml:space="preserve"> macro requests a writ</w:t>
+      </w:r>
+      <w:r>
+        <w:t>e</w:t>
+      </w:r>
+      <w:r>
+        <w:t>.</w:t>
+      </w:r>
+    </w:p>
+    <w:p>
+      <w:pPr>
+        <w:pStyle w:val="ListParagraph"/>
+        <w:numPr>
+          <w:ilvl w:val="1"/>
+          <w:numId w:val="4"/>
+        </w:numPr>
+      </w:pPr>
+      <w:r>
+        <w:t xml:space="preserve">inp_pop fires when </w:t>
+      </w:r>
+      <w:r>
+        <w:t xml:space="preserve">either </w:t>
+      </w:r>
+      <w:r>
+        <w:t>macro</w:t>
+      </w:r>
+      <w:r>
+        <w:t xml:space="preserve"> requests a feature load.</w:t>
+      </w:r>
+    </w:p>
+    <w:p>
+      <w:pPr>
+        <w:pStyle w:val="ListParagraph"/>
+        <w:numPr>
+          <w:ilvl w:val="1"/>
+          <w:numId w:val="4"/>
+        </w:numPr>
+      </w:pPr>
+      <w:r>
+        <w:t>out_push</w:t>
+      </w:r>
+      <w:r>
+        <w:t xml:space="preserve"> f</w:t>
+      </w:r>
+      <w:r>
+        <w:t>ires when the selected DIMC's READYN goes low (pipeline done).</w:t>
+      </w:r>
+    </w:p>
+    <w:p>
+      <w:pPr>
+        <w:pStyle w:val="ListParagraph"/>
+        <w:numPr>
+          <w:ilvl w:val="0"/>
+          <w:numId w:val="4"/>
+        </w:numPr>
+      </w:pPr>
+      <w:r>
+        <w:rPr>
+          <w:b/>
+          <w:bCs/>
+        </w:rPr>
+        <w:t>NOTE:</w:t>
+      </w:r>
+      <w:r>
+        <w:t xml:space="preserve"> simultaneous writes consume one shared FIFO word and present</w:t>
+      </w:r>
+      <w:r>
+        <w:t>s</w:t>
+      </w:r>
+      <w:r>
+        <w:t xml:space="preserve"> it to both macros.</w:t>
+      </w:r>
+    </w:p>
+    <w:p>
+      <w:pPr>
+        <w:pStyle w:val="Heading3"/>
+      </w:pPr>
+      <w:r>
+        <w:t>Pipeline</w:t>
+      </w:r>
+      <w:r>
+        <w:t xml:space="preserve"> </w:t>
+      </w:r>
+    </w:p>
+    <w:p>
+      <w:pPr>
+        <w:pStyle w:val="ListParagraph"/>
+        <w:numPr>
+          <w:ilvl w:val="0"/>
+          <w:numId w:val="5"/>
+        </w:numPr>
+      </w:pPr>
+      <w:proofErr w:type="gramStart"/>
+      <w:r>
+        <w:t>Similar to</w:t>
+      </w:r>
+      <w:proofErr w:type="gramEnd"/>
+      <w:r>
+        <w:t xml:space="preserve"> spatz_dimc module but t</w:t>
+      </w:r>
+      <w:r>
+        <w:t>he result becomes available at the output ports at N+</w:t>
+      </w:r>
+      <w:r>
+        <w:t>5</w:t>
+      </w:r>
+      <w:r>
+        <w:t>.</w:t>
+      </w:r>
+    </w:p>
+    <w:p>
+      <w:pPr>
+        <w:pStyle w:val="ListParagraph"/>
+        <w:numPr>
+          <w:ilvl w:val="0"/>
+          <w:numId w:val="5"/>
+        </w:numPr>
+      </w:pPr>
+      <w:r>
+        <w:t xml:space="preserve">This one clock cycle delay is needed to transfer the output signal </w:t>
+      </w:r>
+      <w:r>
+        <w:t>from</w:t>
+      </w:r>
+      <w:r>
+        <w:t xml:space="preserve"> the DIMC macro output to the output FIFO. </w:t>
+      </w:r>
+    </w:p>
+    <w:p>
+      <w:pPr>
+        <w:pStyle w:val="Heading3"/>
+      </w:pPr>
+      <w:r>
+        <w:t>Current Limitations</w:t>
+      </w:r>
+    </w:p>
+    <w:p>
+      <w:pPr>
+        <w:pStyle w:val="ListParagraph"/>
+        <w:numPr>
+          <w:ilvl w:val="0"/>
+          <w:numId w:val="3"/>
+        </w:numPr>
+      </w:pPr>
+      <w:r>
+        <w:t>Non-default SECTION_WIDTH values are not fully supported yet.</w:t>
+      </w:r>
+    </w:p>
+    <w:p>
+      <w:pPr>
+        <w:pStyle w:val="ListParagraph"/>
+        <w:numPr>
+          <w:ilvl w:val="0"/>
+          <w:numId w:val="3"/>
+        </w:numPr>
+      </w:pPr>
+      <w:r>
+        <w:rPr>
+          <w:sz w:val="19"/>
+          <w:szCs w:val="19"/>
+        </w:rPr>
+        <w:t xml:space="preserve">Parameters </w:t>
+      </w:r>
+      <w:r>
+        <w:rPr>
+          <w:sz w:val="19"/>
+          <w:szCs w:val="19"/>
+        </w:rPr>
+        <w:t>INP_FIFO_DEPTH</w:t>
+      </w:r>
+      <w:r>
+        <w:rPr>
+          <w:sz w:val="19"/>
+          <w:szCs w:val="19"/>
+        </w:rPr>
+        <w:t xml:space="preserve"> </w:t>
+      </w:r>
+      <w:r>
+        <w:rPr>
+          <w:sz w:val="19"/>
+          <w:szCs w:val="19"/>
+        </w:rPr>
+        <w:t>WGT_FIFO_DEPTH</w:t>
+      </w:r>
+      <w:r>
+        <w:rPr>
+          <w:sz w:val="19"/>
+          <w:szCs w:val="19"/>
+        </w:rPr>
+        <w:t xml:space="preserve">, </w:t>
+      </w:r>
+      <w:r>
+        <w:rPr>
+          <w:sz w:val="19"/>
+          <w:szCs w:val="19"/>
+        </w:rPr>
+        <w:t xml:space="preserve">and </w:t>
+      </w:r>
+      <w:r>
+        <w:rPr>
+          <w:sz w:val="19"/>
+          <w:szCs w:val="19"/>
+        </w:rPr>
+        <w:t>OUT_FIFO_DEPTH</w:t>
+      </w:r>
+      <w:r>
+        <w:rPr>
+          <w:sz w:val="19"/>
+          <w:szCs w:val="19"/>
+        </w:rPr>
+        <w:t xml:space="preserve"> </w:t>
+      </w:r>
+      <w:r>
+        <w:rPr>
+          <w:sz w:val="19"/>
+          <w:szCs w:val="19"/>
+        </w:rPr>
+        <w:t xml:space="preserve">are not </w:t>
+      </w:r>
+      <w:r>
+        <w:rPr>
+          <w:sz w:val="19"/>
+          <w:szCs w:val="19"/>
+        </w:rPr>
+        <w:t>decided</w:t>
+      </w:r>
+      <w:r>
+        <w:rPr>
+          <w:sz w:val="19"/>
+          <w:szCs w:val="19"/>
+        </w:rPr>
+        <w:t xml:space="preserve"> yet.</w:t>
       </w:r>
     </w:p>
     <w:p>
@@ -828,10 +1778,7 @@
         </w:numPr>
       </w:pPr>
       <w:r>
-        <w:t xml:space="preserve">Module is </w:t>
-      </w:r>
-      <w:r>
-        <w:t xml:space="preserve">spatz_dimc, instantiated as i_dut with SECTION_WIDTH=256. </w:t>
+        <w:t xml:space="preserve">Module is spatz_dimc, instantiated as i_dut with SECTION_WIDTH=256. </w:t>
       </w:r>
     </w:p>
     <w:p>
@@ -843,13 +1790,7 @@
         </w:numPr>
       </w:pPr>
       <w:r>
-        <w:t xml:space="preserve">All compute tests except Test 8 </w:t>
-      </w:r>
-      <w:r>
-        <w:t>use sign_8b=00</w:t>
-      </w:r>
-      <w:r>
-        <w:t xml:space="preserve">. </w:t>
+        <w:t xml:space="preserve">All compute tests except Test 8 use sign_8b=00. </w:t>
       </w:r>
       <w:r>
         <w:rPr>
@@ -859,19 +1800,7 @@
         <w:t>Test 8</w:t>
       </w:r>
       <w:r>
-        <w:t xml:space="preserve"> uses sign_8b</w:t>
-      </w:r>
-      <w:r>
-        <w:t xml:space="preserve"> </w:t>
-      </w:r>
-      <w:r>
-        <w:t>=</w:t>
-      </w:r>
-      <w:r>
-        <w:t xml:space="preserve"> </w:t>
-      </w:r>
-      <w:r>
-        <w:t>01, 10, and 11.</w:t>
+        <w:t xml:space="preserve"> uses sign_8b = 01, 10, and 11.</w:t>
       </w:r>
     </w:p>
     <w:p>
@@ -892,16 +1821,7 @@
         <w:t>operand</w:t>
       </w:r>
       <w:r>
-        <w:t xml:space="preserve">s of </w:t>
-      </w:r>
-      <w:r>
-        <w:t>kernel/feature</w:t>
-      </w:r>
-      <w:r>
-        <w:t xml:space="preserve"> are signed</w:t>
-      </w:r>
-      <w:r>
-        <w:t>.</w:t>
+        <w:t>s of kernel/feature are signed.</w:t>
       </w:r>
     </w:p>
     <w:p>
@@ -913,13 +1833,7 @@
         </w:numPr>
       </w:pPr>
       <w:r>
-        <w:t xml:space="preserve">sign_8b </w:t>
-      </w:r>
-      <w:r>
-        <w:t>=</w:t>
-      </w:r>
-      <w:r>
-        <w:t>00 selects unsigned/unsigned</w:t>
+        <w:t>sign_8b =00 selects unsigned/unsigned</w:t>
       </w:r>
     </w:p>
     <w:p>
@@ -931,13 +1845,7 @@
         </w:numPr>
       </w:pPr>
       <w:r>
-        <w:t xml:space="preserve">sign_8b </w:t>
-      </w:r>
-      <w:r>
-        <w:t>=</w:t>
-      </w:r>
-      <w:r>
-        <w:t xml:space="preserve">01 selects signed/unsigned </w:t>
+        <w:t xml:space="preserve">sign_8b =01 selects signed/unsigned </w:t>
       </w:r>
     </w:p>
     <w:p>
@@ -949,13 +1857,7 @@
         </w:numPr>
       </w:pPr>
       <w:r>
-        <w:t xml:space="preserve">sign_8b </w:t>
-      </w:r>
-      <w:r>
-        <w:t>=</w:t>
-      </w:r>
-      <w:r>
-        <w:t>10 selects unsigned/signed</w:t>
+        <w:t>sign_8b =10 selects unsigned/signed</w:t>
       </w:r>
     </w:p>
     <w:p>
@@ -967,13 +1869,7 @@
         </w:numPr>
       </w:pPr>
       <w:r>
-        <w:t xml:space="preserve">sign_8b </w:t>
-      </w:r>
-      <w:r>
-        <w:t>=</w:t>
-      </w:r>
-      <w:r>
-        <w:t xml:space="preserve">11 selects signed/signed </w:t>
+        <w:t xml:space="preserve">sign_8b =11 selects signed/signed </w:t>
       </w:r>
     </w:p>
     <w:p>
@@ -985,6 +1881,7 @@
         </w:numPr>
       </w:pPr>
       <w:r>
+        <w:lastRenderedPageBreak/>
         <w:t xml:space="preserve">All compute tests except Test 9 use MODE=11. </w:t>
       </w:r>
       <w:r>
@@ -1196,15 +2093,23 @@
                 <w:sz w:val="19"/>
                 <w:szCs w:val="19"/>
               </w:rPr>
-              <w:t xml:space="preserve">128 lines: four consecutive sections for row 0, then row 1, through row 31. Sections are ordered 0–3. Each line is one 256-bit section containing 32 </w:t>
-            </w:r>
-            <w:r>
-              <w:rPr>
-                <w:sz w:val="19"/>
-                <w:szCs w:val="19"/>
-              </w:rPr>
-              <w:lastRenderedPageBreak/>
-              <w:t>bytes; byte 0 is the least-significant byte.</w:t>
+              <w:t xml:space="preserve">128 lines: four consecutive sections for row 0, then row 1, through row 31. Sections are ordered 0–3. Each line is one 256-bit section containing 32 bytes; byte 0 is the </w:t>
+            </w:r>
+            <w:proofErr w:type="gramStart"/>
+            <w:r>
+              <w:rPr>
+                <w:sz w:val="19"/>
+                <w:szCs w:val="19"/>
+              </w:rPr>
+              <w:t>least-significant</w:t>
+            </w:r>
+            <w:proofErr w:type="gramEnd"/>
+            <w:r>
+              <w:rPr>
+                <w:sz w:val="19"/>
+                <w:szCs w:val="19"/>
+              </w:rPr>
+              <w:t xml:space="preserve"> byte.</w:t>
             </w:r>
           </w:p>
         </w:tc>
@@ -1221,7 +2126,6 @@
                 <w:sz w:val="19"/>
                 <w:szCs w:val="19"/>
               </w:rPr>
-              <w:lastRenderedPageBreak/>
               <w:t>feature_vector.txt</w:t>
             </w:r>
           </w:p>
@@ -1250,7 +2154,23 @@
                 <w:sz w:val="19"/>
                 <w:szCs w:val="19"/>
               </w:rPr>
-              <w:t>Four consecutive lines for sections 0–3 of one feature vector. Each line is one 256-bit section containing 32 bytes; byte 0 is the least-significant byte.</w:t>
+              <w:t xml:space="preserve">Four consecutive lines for sections 0–3 of one feature vector. Each line is one 256-bit section containing 32 bytes; byte 0 is the </w:t>
+            </w:r>
+            <w:proofErr w:type="gramStart"/>
+            <w:r>
+              <w:rPr>
+                <w:sz w:val="19"/>
+                <w:szCs w:val="19"/>
+              </w:rPr>
+              <w:t>least-significant</w:t>
+            </w:r>
+            <w:proofErr w:type="gramEnd"/>
+            <w:r>
+              <w:rPr>
+                <w:sz w:val="19"/>
+                <w:szCs w:val="19"/>
+              </w:rPr>
+              <w:t xml:space="preserve"> byte.</w:t>
             </w:r>
           </w:p>
         </w:tc>
@@ -1526,21 +2446,7 @@
                 <w:sz w:val="19"/>
                 <w:szCs w:val="19"/>
               </w:rPr>
-              <w:t>golden_sign_</w:t>
-            </w:r>
-            <w:r>
-              <w:rPr>
-                <w:sz w:val="19"/>
-                <w:szCs w:val="19"/>
-              </w:rPr>
-              <w:t>XY</w:t>
-            </w:r>
-            <w:r>
-              <w:rPr>
-                <w:sz w:val="19"/>
-                <w:szCs w:val="19"/>
-              </w:rPr>
-              <w:t>_psum_32bit.txt</w:t>
+              <w:t>golden_sign_XY_psum_32bit.txt</w:t>
             </w:r>
           </w:p>
         </w:tc>
@@ -1560,21 +2466,7 @@
                 <w:sz w:val="19"/>
                 <w:szCs w:val="19"/>
               </w:rPr>
-              <w:t>Expected PSOUT values for Test 8, sign_8b=</w:t>
-            </w:r>
-            <w:r>
-              <w:rPr>
-                <w:sz w:val="19"/>
-                <w:szCs w:val="19"/>
-              </w:rPr>
-              <w:t>XY</w:t>
-            </w:r>
-            <w:r>
-              <w:rPr>
-                <w:sz w:val="19"/>
-                <w:szCs w:val="19"/>
-              </w:rPr>
-              <w:t>.</w:t>
+              <w:t>Expected PSOUT values for Test 8, sign_8b=XY.</w:t>
             </w:r>
           </w:p>
         </w:tc>
@@ -1594,7 +2486,15 @@
                 <w:sz w:val="19"/>
                 <w:szCs w:val="19"/>
               </w:rPr>
-              <w:t>32 lines ordered by kernel row 0–31, with no header or separators. Each line is one pre-clipping 32-bit PSOUT value written as eight hexadecimal digits. Negative values use two’s-complement representation.</w:t>
+              <w:t xml:space="preserve">32 lines ordered by kernel row 0–31, with no header or separators. Each line is one pre-clipping 32-bit PSOUT value written as eight hexadecimal digits. Negative values use two’s-complement </w:t>
+            </w:r>
+            <w:r>
+              <w:rPr>
+                <w:sz w:val="19"/>
+                <w:szCs w:val="19"/>
+              </w:rPr>
+              <w:lastRenderedPageBreak/>
+              <w:t>representation.</w:t>
             </w:r>
           </w:p>
         </w:tc>
@@ -1617,21 +2517,8 @@
                 <w:sz w:val="19"/>
                 <w:szCs w:val="19"/>
               </w:rPr>
-              <w:t>golden_mode_</w:t>
-            </w:r>
-            <w:r>
-              <w:rPr>
-                <w:sz w:val="19"/>
-                <w:szCs w:val="19"/>
-              </w:rPr>
-              <w:t>XY</w:t>
-            </w:r>
-            <w:r>
-              <w:rPr>
-                <w:sz w:val="19"/>
-                <w:szCs w:val="19"/>
-              </w:rPr>
-              <w:t>_clipped_8bit.txt</w:t>
+              <w:lastRenderedPageBreak/>
+              <w:t>golden_mode_XY_clipped_8bit.txt</w:t>
             </w:r>
           </w:p>
         </w:tc>
@@ -1651,21 +2538,7 @@
                 <w:sz w:val="19"/>
                 <w:szCs w:val="19"/>
               </w:rPr>
-              <w:t>Expected SOUT values for Test 9, MODE=</w:t>
-            </w:r>
-            <w:r>
-              <w:rPr>
-                <w:sz w:val="19"/>
-                <w:szCs w:val="19"/>
-              </w:rPr>
-              <w:t>XY</w:t>
-            </w:r>
-            <w:r>
-              <w:rPr>
-                <w:sz w:val="19"/>
-                <w:szCs w:val="19"/>
-              </w:rPr>
-              <w:t>.</w:t>
+              <w:t>Expected SOUT values for Test 9, MODE=XY.</w:t>
             </w:r>
           </w:p>
         </w:tc>
@@ -1702,21 +2575,7 @@
                 <w:sz w:val="19"/>
                 <w:szCs w:val="19"/>
               </w:rPr>
-              <w:t>golden_mode_</w:t>
-            </w:r>
-            <w:r>
-              <w:rPr>
-                <w:sz w:val="19"/>
-                <w:szCs w:val="19"/>
-              </w:rPr>
-              <w:t>XY</w:t>
-            </w:r>
-            <w:r>
-              <w:rPr>
-                <w:sz w:val="19"/>
-                <w:szCs w:val="19"/>
-              </w:rPr>
-              <w:t>_psum_32bit.txt</w:t>
+              <w:t>golden_mode_XY_psum_32bit.txt</w:t>
             </w:r>
           </w:p>
         </w:tc>
@@ -1730,21 +2589,7 @@
                 <w:sz w:val="19"/>
                 <w:szCs w:val="19"/>
               </w:rPr>
-              <w:t>Expected PSOUT values for Test 9, MODE=</w:t>
-            </w:r>
-            <w:r>
-              <w:rPr>
-                <w:sz w:val="19"/>
-                <w:szCs w:val="19"/>
-              </w:rPr>
-              <w:t>XY</w:t>
-            </w:r>
-            <w:r>
-              <w:rPr>
-                <w:sz w:val="19"/>
-                <w:szCs w:val="19"/>
-              </w:rPr>
-              <w:t>.</w:t>
+              <w:t>Expected PSOUT values for Test 9, MODE=XY.</w:t>
             </w:r>
           </w:p>
         </w:tc>
@@ -1765,6 +2610,18 @@
       </w:tr>
     </w:tbl>
     <w:p>
+      <w:r>
+        <w:rPr>
+          <w:b/>
+        </w:rPr>
+        <w:t>Files g</w:t>
+      </w:r>
+      <w:r>
+        <w:rPr>
+          <w:b/>
+        </w:rPr>
+        <w:t xml:space="preserve">enerator: </w:t>
+      </w:r>
       <w:r>
         <w:t>All files are generated by stimuli/spatz_dimc_stim.py.</w:t>
       </w:r>
@@ -1790,7 +2647,6 @@
         <w:spacing w:before="240" w:after="100"/>
       </w:pPr>
       <w:r>
-        <w:lastRenderedPageBreak/>
         <w:t>Test 1 — Reset Verification</w:t>
       </w:r>
     </w:p>
@@ -1814,17 +2670,6 @@
       </w:r>
       <w:r>
         <w:t>None logically required.</w:t>
-      </w:r>
-    </w:p>
-    <w:p>
-      <w:r>
-        <w:rPr>
-          <w:b/>
-        </w:rPr>
-        <w:t xml:space="preserve">Generator: </w:t>
-      </w:r>
-      <w:r>
-        <w:t>None.</w:t>
       </w:r>
     </w:p>
     <w:p>
@@ -1861,17 +2706,6 @@
       </w:r>
     </w:p>
     <w:p>
-      <w:r>
-        <w:rPr>
-          <w:b/>
-        </w:rPr>
-        <w:t xml:space="preserve">Generator: </w:t>
-      </w:r>
-      <w:r>
-        <w:t>stimuli/spatz_dimc_stim.py.</w:t>
-      </w:r>
-    </w:p>
-    <w:p>
       <w:pPr>
         <w:pStyle w:val="Heading4"/>
         <w:keepNext/>
@@ -1905,17 +2739,6 @@
       </w:r>
     </w:p>
     <w:p>
-      <w:r>
-        <w:rPr>
-          <w:b/>
-        </w:rPr>
-        <w:t xml:space="preserve">Generator: </w:t>
-      </w:r>
-      <w:r>
-        <w:t>stimuli/spatz_dimc_stim.py.</w:t>
-      </w:r>
-    </w:p>
-    <w:p>
       <w:pPr>
         <w:pStyle w:val="Heading4"/>
         <w:keepNext/>
@@ -1934,7 +2757,15 @@
         <w:t xml:space="preserve">Purpose: </w:t>
       </w:r>
       <w:r>
-        <w:t>Read kernel row 0 section 0 through Q while writing row 0 section 1 through the independent write port, then verify both operations.</w:t>
+        <w:t xml:space="preserve">Read kernel row 0 section 0 through Q while writing row 0 section 1 through the </w:t>
+      </w:r>
+      <w:proofErr w:type="gramStart"/>
+      <w:r>
+        <w:t>independent write</w:t>
+      </w:r>
+      <w:proofErr w:type="gramEnd"/>
+      <w:r>
+        <w:t xml:space="preserve"> port, then verify both operations.</w:t>
       </w:r>
     </w:p>
     <w:p>
@@ -1946,17 +2777,6 @@
       </w:r>
       <w:r>
         <w:t>kernel_weights.txt; expected values are derived from the stimulus.</w:t>
-      </w:r>
-    </w:p>
-    <w:p>
-      <w:r>
-        <w:rPr>
-          <w:b/>
-        </w:rPr>
-        <w:t xml:space="preserve">Generator: </w:t>
-      </w:r>
-      <w:r>
-        <w:t>stimuli/spatz_dimc_stim.py.</w:t>
       </w:r>
     </w:p>
     <w:p>
@@ -1978,25 +2798,18 @@
         <w:t xml:space="preserve">Purpose: </w:t>
       </w:r>
       <w:r>
-        <w:t xml:space="preserve">Load the kernel and feature vector, compute all 32 rows with </w:t>
-      </w:r>
-      <w:proofErr w:type="spellStart"/>
-      <w:r>
-        <w:t>compute_mask</w:t>
-      </w:r>
-      <w:proofErr w:type="spellEnd"/>
-      <w:r>
-        <w:t>=0, and compare PSOUT and SOUT.</w:t>
-      </w:r>
-    </w:p>
-    <w:p>
-      <w:r>
-        <w:t>Stimulus/golden files:</w:t>
-      </w:r>
-    </w:p>
-    <w:p>
-      <w:r>
-        <w:t>Generator:</w:t>
+        <w:t>Load the kernel and feature vector, compute all 32 rows with compute_mask=0, and compare PSOUT and SOUT.</w:t>
+      </w:r>
+    </w:p>
+    <w:p>
+      <w:r>
+        <w:rPr>
+          <w:b/>
+        </w:rPr>
+        <w:t xml:space="preserve">Stimulus/golden files: </w:t>
+      </w:r>
+      <w:r>
+        <w:t>kernel_weights.txt, feature_vector.txt, golden_psum_32bit.txt, and golden_clipped_8bit.txt.</w:t>
       </w:r>
     </w:p>
     <w:p>
@@ -2033,17 +2846,6 @@
       </w:r>
     </w:p>
     <w:p>
-      <w:r>
-        <w:rPr>
-          <w:b/>
-        </w:rPr>
-        <w:t xml:space="preserve">Generator: </w:t>
-      </w:r>
-      <w:r>
-        <w:t>stimuli/spatz_dimc_stim.py.</w:t>
-      </w:r>
-    </w:p>
-    <w:p>
       <w:pPr>
         <w:pStyle w:val="Heading4"/>
         <w:keepNext/>
@@ -2051,13 +2853,13 @@
         <w:spacing w:before="240" w:after="100"/>
       </w:pPr>
       <w:r>
-        <w:t xml:space="preserve">Test 7 — </w:t>
-      </w:r>
-      <w:proofErr w:type="spellStart"/>
-      <w:r>
-        <w:t>compute_mask</w:t>
-      </w:r>
-      <w:proofErr w:type="spellEnd"/>
+        <w:t>Test 7 — compute_</w:t>
+      </w:r>
+      <w:proofErr w:type="gramStart"/>
+      <w:r>
+        <w:t>mask</w:t>
+      </w:r>
+      <w:proofErr w:type="gramEnd"/>
       <w:r>
         <w:t xml:space="preserve"> Masking Sweep</w:t>
       </w:r>
@@ -2078,21 +2880,11 @@
         <w:rPr>
           <w:b/>
         </w:rPr>
+        <w:lastRenderedPageBreak/>
         <w:t xml:space="preserve">Stimulus/golden files: </w:t>
       </w:r>
       <w:r>
         <w:t>kernel_weights.txt, feature_vector.txt, golden_psum_with_masking_32bit.txt, and golden_with_masking_8bit.txt.</w:t>
-      </w:r>
-    </w:p>
-    <w:p>
-      <w:r>
-        <w:rPr>
-          <w:b/>
-        </w:rPr>
-        <w:t xml:space="preserve">Generator: </w:t>
-      </w:r>
-      <w:r>
-        <w:t>stimuli/spatz_dimc_stim.py.</w:t>
       </w:r>
     </w:p>
     <w:p>
@@ -2129,18 +2921,6 @@
       </w:r>
     </w:p>
     <w:p>
-      <w:r>
-        <w:rPr>
-          <w:b/>
-        </w:rPr>
-        <w:lastRenderedPageBreak/>
-        <w:t xml:space="preserve">Generator: </w:t>
-      </w:r>
-      <w:r>
-        <w:t>stimuli/spatz_dimc_stim.py.</w:t>
-      </w:r>
-    </w:p>
-    <w:p>
       <w:pPr>
         <w:pStyle w:val="Heading4"/>
         <w:keepNext/>
@@ -2166,10 +2946,7 @@
         <w:t xml:space="preserve"> </w:t>
       </w:r>
       <w:r>
-        <w:t xml:space="preserve">with 1-bit, 2-bit and 4-bit </w:t>
-      </w:r>
-      <w:r>
-        <w:t>precisions</w:t>
+        <w:t>with 1-bit, 2-bit and 4-bit precisions</w:t>
       </w:r>
     </w:p>
     <w:p>
@@ -2180,27 +2957,12 @@
         <w:t xml:space="preserve">Purpose: </w:t>
       </w:r>
       <w:r>
-        <w:t>Compute MAC with</w:t>
-      </w:r>
-      <w:r>
-        <w:t xml:space="preserve"> modes of 1-bit, 2-bit, 4-bit </w:t>
+        <w:t xml:space="preserve">Compute MAC with modes of 1-bit, 2-bit, 4-bit precision for all kernel rows, and compare PSOUT and SOUT with </w:t>
       </w:r>
       <w:r>
         <w:t>precision</w:t>
       </w:r>
       <w:r>
-        <w:t xml:space="preserve"> for all kernel rows</w:t>
-      </w:r>
-      <w:r>
-        <w:t>, and c</w:t>
-      </w:r>
-      <w:r>
-        <w:t xml:space="preserve">ompare PSOUT and SOUT with </w:t>
-      </w:r>
-      <w:r>
-        <w:t>precision</w:t>
-      </w:r>
-      <w:r>
         <w:t>-specific golden values.</w:t>
       </w:r>
     </w:p>
@@ -2234,20 +2996,787 @@
       </w:r>
     </w:p>
     <w:p>
-      <w:r>
+      <w:pPr>
+        <w:pStyle w:val="Heading3"/>
+      </w:pPr>
+    </w:p>
+    <w:p>
+      <w:pPr>
+        <w:pStyle w:val="Heading3"/>
+      </w:pPr>
+      <w:r>
+        <w:t>Current Limitations</w:t>
+      </w:r>
+    </w:p>
+    <w:p>
+      <w:pPr>
+        <w:ind w:left="480" w:hanging="240"/>
+      </w:pPr>
+      <w:r>
+        <w:t>• Tests cover only SECTION_WIDTH=256</w:t>
+      </w:r>
+      <w:r>
+        <w:t>.</w:t>
+      </w:r>
+    </w:p>
+    <w:p>
+      <w:pPr>
+        <w:ind w:left="480" w:hanging="240"/>
+      </w:pPr>
+      <w:r>
+        <w:t xml:space="preserve">• All </w:t>
+      </w:r>
+      <w:r>
+        <w:t xml:space="preserve">stimulus </w:t>
+      </w:r>
+      <w:r>
+        <w:t>files are loaded unconditionally, even when their associated tests are disabled.</w:t>
+      </w:r>
+    </w:p>
+    <w:p>
+      <w:pPr>
+        <w:pStyle w:val="Heading2"/>
+      </w:pPr>
+      <w:r>
+        <w:t>tb_dimc</w:t>
+      </w:r>
+      <w:r>
+        <w:t>_dual</w:t>
+      </w:r>
+      <w:r>
+        <w:t>.sv</w:t>
+      </w:r>
+    </w:p>
+    <w:p>
+      <w:pPr>
+        <w:pStyle w:val="Heading3"/>
+      </w:pPr>
+      <w:r>
+        <w:t>Module Under Test</w:t>
+      </w:r>
+    </w:p>
+    <w:p>
+      <w:pPr>
+        <w:pStyle w:val="ListParagraph"/>
+        <w:numPr>
+          <w:ilvl w:val="0"/>
+          <w:numId w:val="2"/>
+        </w:numPr>
+      </w:pPr>
+      <w:r>
+        <w:t>Module is spatz_dim</w:t>
+      </w:r>
+      <w:r>
+        <w:t>_dual</w:t>
+      </w:r>
+      <w:r>
+        <w:t xml:space="preserve">, instantiated as i_dut with SECTION_WIDTH=256. </w:t>
+      </w:r>
+    </w:p>
+    <w:p>
+      <w:pPr>
+        <w:pStyle w:val="ListParagraph"/>
+        <w:numPr>
+          <w:ilvl w:val="0"/>
+          <w:numId w:val="2"/>
+        </w:numPr>
+      </w:pPr>
+      <w:r>
+        <w:t xml:space="preserve">All compute tests </w:t>
+      </w:r>
+      <w:r>
+        <w:t>are on unsigned operations and 8-bit precision.</w:t>
+      </w:r>
+    </w:p>
+    <w:p>
+      <w:pPr>
+        <w:pStyle w:val="Heading3"/>
+      </w:pPr>
+      <w:r>
+        <w:t>Stimulus Files Used</w:t>
+      </w:r>
+    </w:p>
+    <w:p>
+      <w:r>
+        <w:t>Base directory: stimuli/</w:t>
+      </w:r>
+      <w:proofErr w:type="spellStart"/>
+      <w:r>
+        <w:t>spatz_dimc_stims</w:t>
+      </w:r>
+      <w:proofErr w:type="spellEnd"/>
+      <w:r>
+        <w:t>/</w:t>
+      </w:r>
+    </w:p>
+    <w:p>
+      <w:pPr>
+        <w:pStyle w:val="ListParagraph"/>
+        <w:numPr>
+          <w:ilvl w:val="0"/>
+          <w:numId w:val="6"/>
+        </w:numPr>
         <w:rPr>
           <w:b/>
         </w:rPr>
-        <w:t xml:space="preserve">Generator: </w:t>
-      </w:r>
-      <w:r>
-        <w:t>stimuli/spatz_dimc_stim.py.</w:t>
+      </w:pPr>
+      <w:r>
+        <w:t>This tb reuses the same stimulus files used by tb_spatz_dimc.sv</w:t>
+      </w:r>
+    </w:p>
+    <w:p>
+      <w:r>
+        <w:rPr>
+          <w:b/>
+        </w:rPr>
+        <w:t xml:space="preserve">Files generator: </w:t>
+      </w:r>
+      <w:r>
+        <w:t>All files are generated by stimuli/spatz_dimc_stim.py.</w:t>
       </w:r>
     </w:p>
     <w:p>
       <w:pPr>
         <w:pStyle w:val="Heading3"/>
       </w:pPr>
+      <w:r>
+        <w:t>Description of Tests</w:t>
+      </w:r>
+    </w:p>
+    <w:p>
+      <w:pPr>
+        <w:pStyle w:val="Heading4"/>
+        <w:keepNext/>
+        <w:shd w:val="clear" w:color="auto" w:fill="D9EAF7"/>
+        <w:spacing w:before="240" w:after="100"/>
+      </w:pPr>
+      <w:r>
+        <w:t>Test 1 — Reset Verification</w:t>
+      </w:r>
+    </w:p>
+    <w:p>
+      <w:pPr>
+        <w:rPr>
+          <w:b/>
+        </w:rPr>
+      </w:pPr>
+      <w:r>
+        <w:rPr>
+          <w:b/>
+        </w:rPr>
+        <w:t xml:space="preserve">Purpose: </w:t>
+      </w:r>
+      <w:r>
+        <w:rPr>
+          <w:bCs/>
+        </w:rPr>
+        <w:t>Verifies that reset clears outputs, feature buffers, Q, and kernel SRAMs for both DIMCs, while READYN remains high.</w:t>
+      </w:r>
+    </w:p>
+    <w:p>
+      <w:r>
+        <w:rPr>
+          <w:b/>
+        </w:rPr>
+        <w:t xml:space="preserve">Stimulus/golden files: </w:t>
+      </w:r>
+      <w:r>
+        <w:t>None logically required.</w:t>
+      </w:r>
+    </w:p>
+    <w:p>
+      <w:pPr>
+        <w:pStyle w:val="Heading4"/>
+        <w:keepNext/>
+        <w:shd w:val="clear" w:color="auto" w:fill="D9EAF7"/>
+        <w:spacing w:before="240" w:after="100"/>
+      </w:pPr>
+      <w:r>
+        <w:t>Test</w:t>
+      </w:r>
+      <w:r>
+        <w:t>s</w:t>
+      </w:r>
+      <w:r>
+        <w:t xml:space="preserve"> 2</w:t>
+      </w:r>
+      <w:r>
+        <w:t>, 4 and Tests 3, 5 — Kernel</w:t>
+      </w:r>
+      <w:r>
+        <w:t xml:space="preserve"> Write + Read-Back</w:t>
+      </w:r>
+    </w:p>
+    <w:p>
+      <w:pPr>
+        <w:pStyle w:val="ListParagraph"/>
+        <w:numPr>
+          <w:ilvl w:val="0"/>
+          <w:numId w:val="6"/>
+        </w:numPr>
+        <w:rPr>
+          <w:b/>
+          <w:bCs/>
+        </w:rPr>
+      </w:pPr>
+      <w:r>
+        <w:t>Tests 2 and 4 are for DIMC 0 and tests 3 and 5 are for DIMC 1</w:t>
+      </w:r>
+    </w:p>
+    <w:p>
+      <w:r>
+        <w:rPr>
+          <w:b/>
+          <w:bCs/>
+        </w:rPr>
+        <w:t>Purpose:</w:t>
+      </w:r>
+      <w:r>
+        <w:rPr>
+          <w:b/>
+          <w:bCs/>
+        </w:rPr>
+        <w:t xml:space="preserve"> </w:t>
+      </w:r>
+      <w:r>
+        <w:t>Writes all 32 kernel rows</w:t>
+      </w:r>
+      <w:r>
+        <w:rPr>
+          <w:b/>
+          <w:bCs/>
+        </w:rPr>
+        <w:t> </w:t>
+      </w:r>
+      <w:r>
+        <w:t>through</w:t>
+      </w:r>
+      <w:r>
+        <w:t xml:space="preserve"> weight FIFO and verifies by reading Q and comparing to golden model</w:t>
+      </w:r>
+    </w:p>
+    <w:p>
+      <w:r>
+        <w:rPr>
+          <w:b/>
+        </w:rPr>
+        <w:t xml:space="preserve">Stimulus/golden files: </w:t>
+      </w:r>
+      <w:r>
+        <w:t>kernel_weights.txt; the stimulus is also the expected value.</w:t>
+      </w:r>
+    </w:p>
+    <w:p>
+      <w:pPr>
+        <w:pStyle w:val="Heading4"/>
+        <w:keepNext/>
+        <w:shd w:val="clear" w:color="auto" w:fill="D9EAF7"/>
+        <w:spacing w:before="240" w:after="100"/>
+      </w:pPr>
+      <w:r>
+        <w:t xml:space="preserve">Test </w:t>
+      </w:r>
+      <w:r>
+        <w:t>6</w:t>
+      </w:r>
+      <w:r>
+        <w:t xml:space="preserve">, </w:t>
+      </w:r>
+      <w:r>
+        <w:t>7</w:t>
+      </w:r>
+      <w:r>
+        <w:t>, 8, 9</w:t>
+      </w:r>
+      <w:r>
+        <w:t xml:space="preserve"> — </w:t>
+      </w:r>
+      <w:r>
+        <w:t>Loading feature vector and performing dot product</w:t>
+      </w:r>
+    </w:p>
+    <w:p>
+      <w:pPr>
+        <w:pStyle w:val="ListParagraph"/>
+        <w:numPr>
+          <w:ilvl w:val="0"/>
+          <w:numId w:val="6"/>
+        </w:numPr>
+        <w:rPr>
+          <w:b/>
+          <w:bCs/>
+        </w:rPr>
+      </w:pPr>
+      <w:r>
+        <w:t xml:space="preserve">Tests </w:t>
+      </w:r>
+      <w:r>
+        <w:t xml:space="preserve">6 and 8 are </w:t>
+      </w:r>
+      <w:r>
+        <w:t>for DIMC 0 and test</w:t>
+      </w:r>
+      <w:r>
+        <w:t>s</w:t>
+      </w:r>
+      <w:r>
+        <w:t xml:space="preserve"> </w:t>
+      </w:r>
+      <w:r>
+        <w:t xml:space="preserve">7,9 are </w:t>
+      </w:r>
+      <w:r>
+        <w:t>for DIMC 1</w:t>
+      </w:r>
+    </w:p>
+    <w:p>
+      <w:pPr>
+        <w:ind w:left="360"/>
+      </w:pPr>
+      <w:r>
+        <w:rPr>
+          <w:b/>
+          <w:bCs/>
+        </w:rPr>
+        <w:t xml:space="preserve">Purpose: </w:t>
+      </w:r>
+      <w:r>
+        <w:t xml:space="preserve">Loads the feature vector into DIMC 0, computes </w:t>
+      </w:r>
+      <w:r>
+        <w:t xml:space="preserve">1 </w:t>
+      </w:r>
+      <w:r>
+        <w:t xml:space="preserve">row dot product, and checks </w:t>
+      </w:r>
+      <w:r>
+        <w:t>output of FIFO buffer</w:t>
+      </w:r>
+      <w:r>
+        <w:t xml:space="preserve"> against golden data.</w:t>
+      </w:r>
+    </w:p>
+    <w:p>
+      <w:r>
+        <w:rPr>
+          <w:b/>
+        </w:rPr>
+        <w:t xml:space="preserve">Stimulus/golden files: </w:t>
+      </w:r>
+      <w:r>
+        <w:rPr>
+          <w:bCs/>
+        </w:rPr>
+        <w:t>kernel_weights.txt</w:t>
+      </w:r>
+      <w:r>
+        <w:rPr>
+          <w:bCs/>
+        </w:rPr>
+        <w:t>,</w:t>
+      </w:r>
+      <w:r>
+        <w:rPr>
+          <w:b/>
+        </w:rPr>
+        <w:t xml:space="preserve"> </w:t>
+      </w:r>
+      <w:r>
+        <w:t>feature_vector.txt, golden_psum_32bit.txt, golden_clipped_8bit.txt</w:t>
+      </w:r>
+    </w:p>
+    <w:p>
+      <w:pPr>
+        <w:pStyle w:val="Heading4"/>
+        <w:keepNext/>
+        <w:shd w:val="clear" w:color="auto" w:fill="D9EAF7"/>
+        <w:spacing w:before="240" w:after="100"/>
+      </w:pPr>
+      <w:r>
+        <w:lastRenderedPageBreak/>
+        <w:t xml:space="preserve">Test </w:t>
+      </w:r>
+      <w:r>
+        <w:t>10</w:t>
+      </w:r>
+      <w:r>
+        <w:t xml:space="preserve"> </w:t>
+      </w:r>
+      <w:r>
+        <w:t>and 11</w:t>
+      </w:r>
+      <w:r>
+        <w:t xml:space="preserve"> </w:t>
+      </w:r>
+      <w:r>
+        <w:t xml:space="preserve">— </w:t>
+      </w:r>
+      <w:r>
+        <w:t>Full MatVec</w:t>
+      </w:r>
+      <w:r>
+        <w:t xml:space="preserve"> multiplication </w:t>
+      </w:r>
+      <w:r>
+        <w:t xml:space="preserve"> </w:t>
+      </w:r>
+    </w:p>
+    <w:p>
+      <w:pPr>
+        <w:pStyle w:val="ListParagraph"/>
+        <w:numPr>
+          <w:ilvl w:val="0"/>
+          <w:numId w:val="6"/>
+        </w:numPr>
+        <w:ind w:left="360"/>
+        <w:rPr>
+          <w:b/>
+          <w:bCs/>
+        </w:rPr>
+      </w:pPr>
+      <w:r>
+        <w:t>Test</w:t>
+      </w:r>
+      <w:r>
+        <w:t xml:space="preserve"> </w:t>
+      </w:r>
+      <w:r>
+        <w:t>1</w:t>
+      </w:r>
+      <w:r>
+        <w:t xml:space="preserve">0 is </w:t>
+      </w:r>
+      <w:r>
+        <w:t xml:space="preserve">for DIMC 0 and test </w:t>
+      </w:r>
+      <w:r>
+        <w:t xml:space="preserve">11 </w:t>
+      </w:r>
+      <w:r>
+        <w:t>is for DIMC 1</w:t>
+      </w:r>
+    </w:p>
+    <w:p>
+      <w:r>
+        <w:rPr>
+          <w:b/>
+          <w:bCs/>
+        </w:rPr>
+        <w:t xml:space="preserve">Purpose: </w:t>
+      </w:r>
+      <w:r>
+        <w:t xml:space="preserve">Computes all 32 rows on </w:t>
+      </w:r>
+      <w:r>
+        <w:t xml:space="preserve">one </w:t>
+      </w:r>
+      <w:r>
+        <w:t>DIMC</w:t>
+      </w:r>
+      <w:r>
+        <w:t xml:space="preserve"> macro </w:t>
+      </w:r>
+      <w:r>
+        <w:t xml:space="preserve">without draining, then bulk-drains </w:t>
+      </w:r>
+      <w:r>
+        <w:t>output FIFO</w:t>
+      </w:r>
+      <w:r>
+        <w:t xml:space="preserve"> and verifies result order/data against golden PSOUT values.</w:t>
+      </w:r>
+    </w:p>
+    <w:p>
+      <w:pPr>
+        <w:rPr>
+          <w:bCs/>
+        </w:rPr>
+      </w:pPr>
+      <w:r>
+        <w:rPr>
+          <w:b/>
+        </w:rPr>
+        <w:t xml:space="preserve">Stimulus/golden files: </w:t>
+      </w:r>
+      <w:r>
+        <w:rPr>
+          <w:bCs/>
+        </w:rPr>
+        <w:t>kernel_weights.txt, feature_vector.txt, golden_psum_32bit.txt, golden_clipped_8bit.txt</w:t>
+      </w:r>
+    </w:p>
+    <w:p>
+      <w:pPr>
+        <w:pStyle w:val="Heading4"/>
+        <w:keepNext/>
+        <w:shd w:val="clear" w:color="auto" w:fill="D9EAF7"/>
+        <w:spacing w:before="240" w:after="100"/>
+      </w:pPr>
+      <w:r>
+        <w:t xml:space="preserve">Test 12 and 13 </w:t>
+      </w:r>
+      <w:r>
+        <w:t xml:space="preserve">— </w:t>
+      </w:r>
+      <w:r>
+        <w:t xml:space="preserve">compute_mask Sweep </w:t>
+      </w:r>
+      <w:r>
+        <w:t xml:space="preserve">on one </w:t>
+      </w:r>
+      <w:r>
+        <w:t xml:space="preserve">DIMC </w:t>
+      </w:r>
+    </w:p>
+    <w:p>
+      <w:pPr>
+        <w:pStyle w:val="ListParagraph"/>
+        <w:numPr>
+          <w:ilvl w:val="0"/>
+          <w:numId w:val="6"/>
+        </w:numPr>
+        <w:ind w:left="360"/>
+        <w:rPr>
+          <w:b/>
+          <w:bCs/>
+        </w:rPr>
+      </w:pPr>
+      <w:r>
+        <w:t xml:space="preserve">Test </w:t>
+      </w:r>
+      <w:r>
+        <w:t>12</w:t>
+      </w:r>
+      <w:r>
+        <w:t xml:space="preserve"> is for DIMC 0 and test 1</w:t>
+      </w:r>
+      <w:r>
+        <w:t>3</w:t>
+      </w:r>
+      <w:r>
+        <w:t xml:space="preserve"> is for DIMC 1</w:t>
+      </w:r>
+    </w:p>
+    <w:p>
+      <w:r>
+        <w:rPr>
+          <w:b/>
+          <w:bCs/>
+        </w:rPr>
+        <w:t xml:space="preserve">Purpose: </w:t>
+      </w:r>
+      <w:r>
+        <w:t xml:space="preserve">Sweeps six compute_mask values on row 0 of </w:t>
+      </w:r>
+      <w:r>
+        <w:t xml:space="preserve">the </w:t>
+      </w:r>
+      <w:r>
+        <w:t xml:space="preserve">DIMC </w:t>
+      </w:r>
+      <w:r>
+        <w:t xml:space="preserve">macro </w:t>
+      </w:r>
+      <w:r>
+        <w:t>and verifies PSOUT, clipped output, and FIFO order against masked golden files.</w:t>
+      </w:r>
+    </w:p>
+    <w:p>
+      <w:r>
+        <w:rPr>
+          <w:b/>
+        </w:rPr>
+        <w:t xml:space="preserve">Stimulus/golden files: </w:t>
+      </w:r>
+      <w:r>
+        <w:t>kernel_weights.txt, feature_vector.txt, golden_psum_with_masking_32bit.txt, golden_with_masking_8bit.txt</w:t>
+      </w:r>
+    </w:p>
+    <w:p>
+      <w:pPr>
+        <w:pStyle w:val="Heading4"/>
+        <w:keepNext/>
+        <w:shd w:val="clear" w:color="auto" w:fill="D9EAF7"/>
+        <w:spacing w:before="240" w:after="100"/>
+      </w:pPr>
+      <w:r>
+        <w:t xml:space="preserve">Test </w:t>
+      </w:r>
+      <w:r>
+        <w:t>14</w:t>
+      </w:r>
+      <w:r>
+        <w:t xml:space="preserve"> — </w:t>
+      </w:r>
+      <w:r>
+        <w:t xml:space="preserve">Overlapping Computes </w:t>
+      </w:r>
+      <w:r>
+        <w:t>and verifying output FIFO output order</w:t>
+      </w:r>
+    </w:p>
+    <w:p>
+      <w:r>
+        <w:rPr>
+          <w:b/>
+          <w:bCs/>
+        </w:rPr>
+        <w:t xml:space="preserve">Purpose: </w:t>
+      </w:r>
+      <w:r>
+        <w:t xml:space="preserve">Issues DIMC0 row 5 and then DIMC1 row 7 while the first compute is still in flight, and </w:t>
+      </w:r>
+      <w:proofErr w:type="gramStart"/>
+      <w:r>
+        <w:t>verifies</w:t>
+      </w:r>
+      <w:proofErr w:type="gramEnd"/>
+      <w:r>
+        <w:t xml:space="preserve"> both results arrive in </w:t>
+      </w:r>
+      <w:r>
+        <w:t xml:space="preserve">output FIFO </w:t>
+      </w:r>
+      <w:r>
+        <w:t>in issue order.</w:t>
+      </w:r>
+    </w:p>
+    <w:p>
+      <w:r>
+        <w:rPr>
+          <w:b/>
+        </w:rPr>
+        <w:t xml:space="preserve">Stimulus/golden files: </w:t>
+      </w:r>
+      <w:r>
+        <w:t>kernel_weights.txt, feature_vector.txt, golden_psum_32bit.txt</w:t>
+      </w:r>
+      <w:r>
+        <w:t>.</w:t>
+      </w:r>
+    </w:p>
+    <w:p>
+      <w:pPr>
+        <w:pStyle w:val="Heading4"/>
+        <w:keepNext/>
+        <w:shd w:val="clear" w:color="auto" w:fill="D9EAF7"/>
+        <w:spacing w:before="240" w:after="100"/>
+      </w:pPr>
+      <w:r>
+        <w:t xml:space="preserve">Test </w:t>
+      </w:r>
+      <w:r>
+        <w:t>15</w:t>
+      </w:r>
+      <w:r>
+        <w:t xml:space="preserve"> — </w:t>
+      </w:r>
+      <w:r>
+        <w:t>Pipelined MatVec DIMC 0, POP All at End</w:t>
+      </w:r>
+    </w:p>
+    <w:p>
+      <w:r>
+        <w:rPr>
+          <w:b/>
+          <w:bCs/>
+        </w:rPr>
+        <w:t>Purpose:</w:t>
+      </w:r>
+      <w:r>
+        <w:rPr>
+          <w:b/>
+          <w:bCs/>
+        </w:rPr>
+        <w:t xml:space="preserve"> </w:t>
+      </w:r>
+      <w:r>
+        <w:t xml:space="preserve">Reloads kernel/feature, issues one row compute per cycle for all 32 rows, then drains </w:t>
+      </w:r>
+      <w:r>
+        <w:t>output FIFO</w:t>
+      </w:r>
+      <w:r>
+        <w:t xml:space="preserve"> at the end and compares all results to golden PSOUT.</w:t>
+      </w:r>
+    </w:p>
+    <w:p>
+      <w:pPr>
+        <w:rPr>
+          <w:bCs/>
+        </w:rPr>
+      </w:pPr>
+      <w:r>
+        <w:rPr>
+          <w:b/>
+        </w:rPr>
+        <w:t xml:space="preserve">Stimulus/golden files: </w:t>
+      </w:r>
+      <w:r>
+        <w:rPr>
+          <w:bCs/>
+        </w:rPr>
+        <w:t>kernel_weights.txt, feature_vector.txt, golden_psum_32bit.txt</w:t>
+      </w:r>
+    </w:p>
+    <w:p>
+      <w:pPr>
+        <w:pStyle w:val="Heading4"/>
+        <w:keepNext/>
+        <w:shd w:val="clear" w:color="auto" w:fill="D9EAF7"/>
+        <w:spacing w:before="240" w:after="100"/>
+      </w:pPr>
+      <w:r>
+        <w:t xml:space="preserve">Test </w:t>
+      </w:r>
+      <w:r>
+        <w:t>16</w:t>
+      </w:r>
+      <w:r>
+        <w:t xml:space="preserve"> — </w:t>
+      </w:r>
+      <w:r>
+        <w:t>Pipelined MatVec DIMC 0, POP Once Ready</w:t>
+      </w:r>
+    </w:p>
+    <w:p>
+      <w:r>
+        <w:rPr>
+          <w:b/>
+          <w:bCs/>
+        </w:rPr>
+        <w:t>Purpose:</w:t>
+      </w:r>
+      <w:r>
+        <w:rPr>
+          <w:b/>
+          <w:bCs/>
+        </w:rPr>
+        <w:t xml:space="preserve"> </w:t>
+      </w:r>
+      <w:r>
+        <w:t xml:space="preserve">Reloads kernel/feature, issues one row compute per cycle, and pops/checks each </w:t>
+      </w:r>
+      <w:r>
+        <w:t>output FIFO</w:t>
+      </w:r>
+      <w:r>
+        <w:t xml:space="preserve"> result as soon as it becomes ready against golden PSOUT.</w:t>
+      </w:r>
+    </w:p>
+    <w:p>
+      <w:r>
+        <w:rPr>
+          <w:b/>
+        </w:rPr>
+        <w:t xml:space="preserve">Stimulus/golden files: </w:t>
+      </w:r>
+      <w:r>
+        <w:rPr>
+          <w:bCs/>
+        </w:rPr>
+        <w:t>kernel_weights.txt, feature_vector.txt, golden_psum_32bit.txt</w:t>
+      </w:r>
     </w:p>
     <w:p>
       <w:pPr>
@@ -2259,27 +3788,26 @@
     </w:p>
     <w:p>
       <w:pPr>
-        <w:ind w:left="480" w:hanging="240"/>
-      </w:pPr>
-      <w:r>
-        <w:t>• Tests cover only SECTION_WIDTH=256</w:t>
-      </w:r>
-      <w:r>
-        <w:t>.</w:t>
-      </w:r>
-    </w:p>
-    <w:p>
-      <w:pPr>
-        <w:ind w:left="480" w:hanging="240"/>
-      </w:pPr>
-      <w:r>
-        <w:t xml:space="preserve">• All </w:t>
-      </w:r>
-      <w:r>
-        <w:t xml:space="preserve">stimulus </w:t>
-      </w:r>
-      <w:r>
-        <w:t>files are loaded unconditionally, even when their associated tests are disabled.</w:t>
+        <w:pStyle w:val="ListParagraph"/>
+        <w:numPr>
+          <w:ilvl w:val="0"/>
+          <w:numId w:val="2"/>
+        </w:numPr>
+      </w:pPr>
+      <w:r>
+        <w:t>Tests cover only SECTION_WIDTH=256.</w:t>
+      </w:r>
+    </w:p>
+    <w:p>
+      <w:pPr>
+        <w:pStyle w:val="ListParagraph"/>
+        <w:numPr>
+          <w:ilvl w:val="0"/>
+          <w:numId w:val="2"/>
+        </w:numPr>
+      </w:pPr>
+      <w:r>
+        <w:t>All stimulus files are loaded unconditionally, even when their associated tests are disabled.</w:t>
       </w:r>
     </w:p>
     <w:p>
@@ -2481,7 +4009,23 @@
                 <w:sz w:val="19"/>
                 <w:szCs w:val="19"/>
               </w:rPr>
-              <w:t>Section size used to derive the number of sections and bytes per section.</w:t>
+              <w:t xml:space="preserve">Section size </w:t>
+            </w:r>
+            <w:proofErr w:type="gramStart"/>
+            <w:r>
+              <w:rPr>
+                <w:sz w:val="19"/>
+                <w:szCs w:val="19"/>
+              </w:rPr>
+              <w:t>used</w:t>
+            </w:r>
+            <w:proofErr w:type="gramEnd"/>
+            <w:r>
+              <w:rPr>
+                <w:sz w:val="19"/>
+                <w:szCs w:val="19"/>
+              </w:rPr>
+              <w:t xml:space="preserve"> to derive the number of sections and bytes per section.</w:t>
             </w:r>
           </w:p>
         </w:tc>
@@ -2498,6 +4042,7 @@
                 <w:sz w:val="19"/>
                 <w:szCs w:val="19"/>
               </w:rPr>
+              <w:lastRenderedPageBreak/>
               <w:t>COMPUTE_MASK_VALS</w:t>
             </w:r>
           </w:p>
@@ -2838,7 +4383,6 @@
                 <w:sz w:val="19"/>
                 <w:szCs w:val="19"/>
               </w:rPr>
-              <w:lastRenderedPageBreak/>
               <w:t>golden_clipped_8bit.txt</w:t>
             </w:r>
           </w:p>
@@ -3064,28 +4608,7 @@
                 <w:sz w:val="19"/>
                 <w:szCs w:val="19"/>
               </w:rPr>
-              <w:t xml:space="preserve"> </w:t>
-            </w:r>
-            <w:r>
-              <w:rPr>
-                <w:sz w:val="19"/>
-                <w:szCs w:val="19"/>
-              </w:rPr>
-              <w:t>XY refer</w:t>
-            </w:r>
-            <w:r>
-              <w:rPr>
-                <w:sz w:val="19"/>
-                <w:szCs w:val="19"/>
-              </w:rPr>
-              <w:t>s</w:t>
-            </w:r>
-            <w:r>
-              <w:rPr>
-                <w:sz w:val="19"/>
-                <w:szCs w:val="19"/>
-              </w:rPr>
-              <w:t xml:space="preserve"> to whether they are signed.</w:t>
+              <w:t xml:space="preserve"> XY refers to whether they are signed.</w:t>
             </w:r>
           </w:p>
         </w:tc>
@@ -3102,21 +4625,7 @@
                 <w:sz w:val="19"/>
                 <w:szCs w:val="19"/>
               </w:rPr>
-              <w:t>golden_</w:t>
-            </w:r>
-            <w:r>
-              <w:rPr>
-                <w:sz w:val="19"/>
-                <w:szCs w:val="19"/>
-              </w:rPr>
-              <w:t>mode</w:t>
-            </w:r>
-            <w:r>
-              <w:rPr>
-                <w:sz w:val="19"/>
-                <w:szCs w:val="19"/>
-              </w:rPr>
-              <w:t>_XY_clipped_8bit.txt</w:t>
+              <w:t>golden_mode_XY_clipped_8bit.txt</w:t>
             </w:r>
           </w:p>
         </w:tc>
@@ -3130,63 +4639,7 @@
                 <w:sz w:val="19"/>
                 <w:szCs w:val="19"/>
               </w:rPr>
-              <w:t>32 lines ordered by kernel row 0–31 for kernel</w:t>
-            </w:r>
-            <w:r>
-              <w:rPr>
-                <w:sz w:val="19"/>
-                <w:szCs w:val="19"/>
-              </w:rPr>
-              <w:t>-</w:t>
-            </w:r>
-            <w:r>
-              <w:rPr>
-                <w:sz w:val="19"/>
-                <w:szCs w:val="19"/>
-              </w:rPr>
-              <w:t>feature multiplication, with no header or separators. Each line contains one clipped 8-bit SOUT value written as two hexadecimal digits.</w:t>
-            </w:r>
-            <w:r>
-              <w:rPr>
-                <w:sz w:val="19"/>
-                <w:szCs w:val="19"/>
-              </w:rPr>
-              <w:t xml:space="preserve"> </w:t>
-            </w:r>
-            <w:r>
-              <w:rPr>
-                <w:sz w:val="19"/>
-                <w:szCs w:val="19"/>
-              </w:rPr>
-              <w:t>XY refer</w:t>
-            </w:r>
-            <w:r>
-              <w:rPr>
-                <w:sz w:val="19"/>
-                <w:szCs w:val="19"/>
-              </w:rPr>
-              <w:t>s</w:t>
-            </w:r>
-            <w:r>
-              <w:rPr>
-                <w:sz w:val="19"/>
-                <w:szCs w:val="19"/>
-              </w:rPr>
-              <w:t xml:space="preserve"> to </w:t>
-            </w:r>
-            <w:r>
-              <w:rPr>
-                <w:sz w:val="19"/>
-                <w:szCs w:val="19"/>
-              </w:rPr>
-              <w:t>quantization precision used</w:t>
-            </w:r>
-            <w:r>
-              <w:rPr>
-                <w:sz w:val="19"/>
-                <w:szCs w:val="19"/>
-              </w:rPr>
-              <w:t>.</w:t>
+              <w:t>32 lines ordered by kernel row 0–31 for kernel-feature multiplication, with no header or separators. Each line contains one clipped 8-bit SOUT value written as two hexadecimal digits. XY refers to quantization precision used.</w:t>
             </w:r>
           </w:p>
         </w:tc>
@@ -3203,21 +4656,7 @@
                 <w:sz w:val="19"/>
                 <w:szCs w:val="19"/>
               </w:rPr>
-              <w:t>golden_</w:t>
-            </w:r>
-            <w:r>
-              <w:rPr>
-                <w:sz w:val="19"/>
-                <w:szCs w:val="19"/>
-              </w:rPr>
-              <w:t>mode</w:t>
-            </w:r>
-            <w:r>
-              <w:rPr>
-                <w:sz w:val="19"/>
-                <w:szCs w:val="19"/>
-              </w:rPr>
-              <w:t>_XY_psum_32bit.txt</w:t>
+              <w:t>golden_mode_XY_psum_32bit.txt</w:t>
             </w:r>
           </w:p>
         </w:tc>
@@ -3231,21 +4670,15 @@
                 <w:sz w:val="19"/>
                 <w:szCs w:val="19"/>
               </w:rPr>
-              <w:t>32 lines ordered by kernel row 0–31 for signed-kernel, unsigned-feature multiplication, with no header or separators. Each line contains one pre-clipping 32-bit PSOUT value written as eight hexadecimal digits. Negative values use two’s-complement representation.</w:t>
-            </w:r>
-            <w:r>
-              <w:rPr>
-                <w:sz w:val="19"/>
-                <w:szCs w:val="19"/>
-              </w:rPr>
-              <w:t xml:space="preserve"> </w:t>
-            </w:r>
-            <w:r>
-              <w:rPr>
-                <w:sz w:val="19"/>
-                <w:szCs w:val="19"/>
-              </w:rPr>
-              <w:t>XY refers to quantization precision used.</w:t>
+              <w:t xml:space="preserve">32 lines ordered by kernel row 0–31 for signed-kernel, unsigned-feature multiplication, with no header or separators. Each line contains one pre-clipping 32-bit PSOUT value written as eight hexadecimal digits. Negative values use </w:t>
+            </w:r>
+            <w:r>
+              <w:rPr>
+                <w:sz w:val="19"/>
+                <w:szCs w:val="19"/>
+              </w:rPr>
+              <w:lastRenderedPageBreak/>
+              <w:t>two’s-complement representation. XY refers to quantization precision used.</w:t>
             </w:r>
           </w:p>
         </w:tc>
@@ -3264,6 +4697,118 @@
 <file path=word/numbering.xml><?xml version="1.0" encoding="utf-8"?>
 <w:numbering xmlns:wpc="http://schemas.microsoft.com/office/word/2010/wordprocessingCanvas" xmlns:cx="http://schemas.microsoft.com/office/drawing/2014/chartex" xmlns:cx1="http://schemas.microsoft.com/office/drawing/2015/9/8/chartex" xmlns:cx2="http://schemas.microsoft.com/office/drawing/2015/10/21/chartex" xmlns:cx3="http://schemas.microsoft.com/office/drawing/2016/5/9/chartex" xmlns:cx4="http://schemas.microsoft.com/office/drawing/2016/5/10/chartex" xmlns:cx5="http://schemas.microsoft.com/office/drawing/2016/5/11/chartex" xmlns:cx6="http://schemas.microsoft.com/office/drawing/2016/5/12/chartex" xmlns:cx7="http://schemas.microsoft.com/office/drawing/2016/5/13/chartex" xmlns:cx8="http://schemas.microsoft.com/office/drawing/2016/5/14/chartex" xmlns:mc="http://schemas.openxmlformats.org/markup-compatibility/2006" xmlns:aink="http://schemas.microsoft.com/office/drawing/2016/ink" xmlns:am3d="http://schemas.microsoft.com/office/drawing/2017/model3d" xmlns:o="urn:schemas-microsoft-com:office:office" xmlns:oel="http://schemas.microsoft.com/office/2019/extlst" xmlns:r="http://schemas.openxmlformats.org/officeDocument/2006/relationships" xmlns:m="http://schemas.openxmlformats.org/officeDocument/2006/math" xmlns:v="urn:schemas-microsoft-com:vml" xmlns:wp14="http://schemas.microsoft.com/office/word/2010/wordprocessingDrawing" xmlns:wp="http://schemas.openxmlformats.org/drawingml/2006/wordprocessingDrawing" xmlns:w10="urn:schemas-microsoft-com:office:word" xmlns:w="http://schemas.openxmlformats.org/wordprocessingml/2006/main" xmlns:w14="http://schemas.microsoft.com/office/word/2010/wordml" xmlns:w15="http://schemas.microsoft.com/office/word/2012/wordml" xmlns:w16cex="http://schemas.microsoft.com/office/word/2018/wordml/cex" xmlns:w16cid="http://schemas.microsoft.com/office/word/2016/wordml/cid" xmlns:w16="http://schemas.microsoft.com/office/word/2018/wordml" xmlns:w16du="http://schemas.microsoft.com/office/word/2023/wordml/word16du" xmlns:w16sdtdh="http://schemas.microsoft.com/office/word/2020/wordml/sdtdatahash" xmlns:w16sdtfl="http://schemas.microsoft.com/office/word/2024/wordml/sdtformatlock" xmlns:w16se="http://schemas.microsoft.com/office/word/2015/wordml/symex" xmlns:wpg="http://schemas.microsoft.com/office/word/2010/wordprocessingGroup" xmlns:wpi="http://schemas.microsoft.com/office/word/2010/wordprocessingInk" xmlns:wne="http://schemas.microsoft.com/office/word/2006/wordml" xmlns:wps="http://schemas.microsoft.com/office/word/2010/wordprocessingShape" mc:Ignorable="w14 w15 w16se w16cid w16 w16cex w16sdtdh w16sdtfl w16du wp14">
   <w:abstractNum w:abstractNumId="0" w15:restartNumberingAfterBreak="0">
+    <w:nsid w:val="02802A86"/>
+    <w:multiLevelType w:val="hybridMultilevel"/>
+    <w:tmpl w:val="2228BA86"/>
+    <w:lvl w:ilvl="0" w:tplc="ED522020">
+      <w:numFmt w:val="bullet"/>
+      <w:lvlText w:val=""/>
+      <w:lvlJc w:val="left"/>
+      <w:pPr>
+        <w:ind w:left="720" w:hanging="360"/>
+      </w:pPr>
+      <w:rPr>
+        <w:rFonts w:ascii="Symbol" w:eastAsiaTheme="minorEastAsia" w:hAnsi="Symbol" w:cstheme="minorBidi" w:hint="default"/>
+      </w:rPr>
+    </w:lvl>
+    <w:lvl w:ilvl="1" w:tplc="04090003" w:tentative="1">
+      <w:start w:val="1"/>
+      <w:numFmt w:val="bullet"/>
+      <w:lvlText w:val="o"/>
+      <w:lvlJc w:val="left"/>
+      <w:pPr>
+        <w:ind w:left="1440" w:hanging="360"/>
+      </w:pPr>
+      <w:rPr>
+        <w:rFonts w:ascii="Courier New" w:hAnsi="Courier New" w:cs="Courier New" w:hint="default"/>
+      </w:rPr>
+    </w:lvl>
+    <w:lvl w:ilvl="2" w:tplc="04090005" w:tentative="1">
+      <w:start w:val="1"/>
+      <w:numFmt w:val="bullet"/>
+      <w:lvlText w:val=""/>
+      <w:lvlJc w:val="left"/>
+      <w:pPr>
+        <w:ind w:left="2160" w:hanging="360"/>
+      </w:pPr>
+      <w:rPr>
+        <w:rFonts w:ascii="Wingdings" w:hAnsi="Wingdings" w:hint="default"/>
+      </w:rPr>
+    </w:lvl>
+    <w:lvl w:ilvl="3" w:tplc="04090001" w:tentative="1">
+      <w:start w:val="1"/>
+      <w:numFmt w:val="bullet"/>
+      <w:lvlText w:val=""/>
+      <w:lvlJc w:val="left"/>
+      <w:pPr>
+        <w:ind w:left="2880" w:hanging="360"/>
+      </w:pPr>
+      <w:rPr>
+        <w:rFonts w:ascii="Symbol" w:hAnsi="Symbol" w:hint="default"/>
+      </w:rPr>
+    </w:lvl>
+    <w:lvl w:ilvl="4" w:tplc="04090003" w:tentative="1">
+      <w:start w:val="1"/>
+      <w:numFmt w:val="bullet"/>
+      <w:lvlText w:val="o"/>
+      <w:lvlJc w:val="left"/>
+      <w:pPr>
+        <w:ind w:left="3600" w:hanging="360"/>
+      </w:pPr>
+      <w:rPr>
+        <w:rFonts w:ascii="Courier New" w:hAnsi="Courier New" w:cs="Courier New" w:hint="default"/>
+      </w:rPr>
+    </w:lvl>
+    <w:lvl w:ilvl="5" w:tplc="04090005" w:tentative="1">
+      <w:start w:val="1"/>
+      <w:numFmt w:val="bullet"/>
+      <w:lvlText w:val=""/>
+      <w:lvlJc w:val="left"/>
+      <w:pPr>
+        <w:ind w:left="4320" w:hanging="360"/>
+      </w:pPr>
+      <w:rPr>
+        <w:rFonts w:ascii="Wingdings" w:hAnsi="Wingdings" w:hint="default"/>
+      </w:rPr>
+    </w:lvl>
+    <w:lvl w:ilvl="6" w:tplc="04090001" w:tentative="1">
+      <w:start w:val="1"/>
+      <w:numFmt w:val="bullet"/>
+      <w:lvlText w:val=""/>
+      <w:lvlJc w:val="left"/>
+      <w:pPr>
+        <w:ind w:left="5040" w:hanging="360"/>
+      </w:pPr>
+      <w:rPr>
+        <w:rFonts w:ascii="Symbol" w:hAnsi="Symbol" w:hint="default"/>
+      </w:rPr>
+    </w:lvl>
+    <w:lvl w:ilvl="7" w:tplc="04090003" w:tentative="1">
+      <w:start w:val="1"/>
+      <w:numFmt w:val="bullet"/>
+      <w:lvlText w:val="o"/>
+      <w:lvlJc w:val="left"/>
+      <w:pPr>
+        <w:ind w:left="5760" w:hanging="360"/>
+      </w:pPr>
+      <w:rPr>
+        <w:rFonts w:ascii="Courier New" w:hAnsi="Courier New" w:cs="Courier New" w:hint="default"/>
+      </w:rPr>
+    </w:lvl>
+    <w:lvl w:ilvl="8" w:tplc="04090005" w:tentative="1">
+      <w:start w:val="1"/>
+      <w:numFmt w:val="bullet"/>
+      <w:lvlText w:val=""/>
+      <w:lvlJc w:val="left"/>
+      <w:pPr>
+        <w:ind w:left="6480" w:hanging="360"/>
+      </w:pPr>
+      <w:rPr>
+        <w:rFonts w:ascii="Wingdings" w:hAnsi="Wingdings" w:hint="default"/>
+      </w:rPr>
+    </w:lvl>
+  </w:abstractNum>
+  <w:abstractNum w:abstractNumId="1" w15:restartNumberingAfterBreak="0">
     <w:nsid w:val="0F567F21"/>
     <w:multiLevelType w:val="hybridMultilevel"/>
     <w:tmpl w:val="D2A6AE76"/>
@@ -3375,11 +4920,123 @@
       </w:rPr>
     </w:lvl>
   </w:abstractNum>
-  <w:abstractNum w:abstractNumId="1" w15:restartNumberingAfterBreak="0">
-    <w:nsid w:val="7ADA58FE"/>
+  <w:abstractNum w:abstractNumId="2" w15:restartNumberingAfterBreak="0">
+    <w:nsid w:val="2404738E"/>
     <w:multiLevelType w:val="hybridMultilevel"/>
-    <w:tmpl w:val="83B6634C"/>
-    <w:lvl w:ilvl="0" w:tplc="1ED40B58">
+    <w:tmpl w:val="3F6ED7D6"/>
+    <w:lvl w:ilvl="0" w:tplc="3A5ADDD8">
+      <w:numFmt w:val="bullet"/>
+      <w:lvlText w:val="-"/>
+      <w:lvlJc w:val="left"/>
+      <w:pPr>
+        <w:ind w:left="720" w:hanging="360"/>
+      </w:pPr>
+      <w:rPr>
+        <w:rFonts w:ascii="Times New Roman" w:eastAsiaTheme="minorEastAsia" w:hAnsi="Times New Roman" w:cs="Times New Roman" w:hint="default"/>
+      </w:rPr>
+    </w:lvl>
+    <w:lvl w:ilvl="1" w:tplc="04090003" w:tentative="1">
+      <w:start w:val="1"/>
+      <w:numFmt w:val="bullet"/>
+      <w:lvlText w:val="o"/>
+      <w:lvlJc w:val="left"/>
+      <w:pPr>
+        <w:ind w:left="1440" w:hanging="360"/>
+      </w:pPr>
+      <w:rPr>
+        <w:rFonts w:ascii="Courier New" w:hAnsi="Courier New" w:cs="Courier New" w:hint="default"/>
+      </w:rPr>
+    </w:lvl>
+    <w:lvl w:ilvl="2" w:tplc="04090005" w:tentative="1">
+      <w:start w:val="1"/>
+      <w:numFmt w:val="bullet"/>
+      <w:lvlText w:val=""/>
+      <w:lvlJc w:val="left"/>
+      <w:pPr>
+        <w:ind w:left="2160" w:hanging="360"/>
+      </w:pPr>
+      <w:rPr>
+        <w:rFonts w:ascii="Wingdings" w:hAnsi="Wingdings" w:hint="default"/>
+      </w:rPr>
+    </w:lvl>
+    <w:lvl w:ilvl="3" w:tplc="04090001" w:tentative="1">
+      <w:start w:val="1"/>
+      <w:numFmt w:val="bullet"/>
+      <w:lvlText w:val=""/>
+      <w:lvlJc w:val="left"/>
+      <w:pPr>
+        <w:ind w:left="2880" w:hanging="360"/>
+      </w:pPr>
+      <w:rPr>
+        <w:rFonts w:ascii="Symbol" w:hAnsi="Symbol" w:hint="default"/>
+      </w:rPr>
+    </w:lvl>
+    <w:lvl w:ilvl="4" w:tplc="04090003" w:tentative="1">
+      <w:start w:val="1"/>
+      <w:numFmt w:val="bullet"/>
+      <w:lvlText w:val="o"/>
+      <w:lvlJc w:val="left"/>
+      <w:pPr>
+        <w:ind w:left="3600" w:hanging="360"/>
+      </w:pPr>
+      <w:rPr>
+        <w:rFonts w:ascii="Courier New" w:hAnsi="Courier New" w:cs="Courier New" w:hint="default"/>
+      </w:rPr>
+    </w:lvl>
+    <w:lvl w:ilvl="5" w:tplc="04090005" w:tentative="1">
+      <w:start w:val="1"/>
+      <w:numFmt w:val="bullet"/>
+      <w:lvlText w:val=""/>
+      <w:lvlJc w:val="left"/>
+      <w:pPr>
+        <w:ind w:left="4320" w:hanging="360"/>
+      </w:pPr>
+      <w:rPr>
+        <w:rFonts w:ascii="Wingdings" w:hAnsi="Wingdings" w:hint="default"/>
+      </w:rPr>
+    </w:lvl>
+    <w:lvl w:ilvl="6" w:tplc="04090001" w:tentative="1">
+      <w:start w:val="1"/>
+      <w:numFmt w:val="bullet"/>
+      <w:lvlText w:val=""/>
+      <w:lvlJc w:val="left"/>
+      <w:pPr>
+        <w:ind w:left="5040" w:hanging="360"/>
+      </w:pPr>
+      <w:rPr>
+        <w:rFonts w:ascii="Symbol" w:hAnsi="Symbol" w:hint="default"/>
+      </w:rPr>
+    </w:lvl>
+    <w:lvl w:ilvl="7" w:tplc="04090003" w:tentative="1">
+      <w:start w:val="1"/>
+      <w:numFmt w:val="bullet"/>
+      <w:lvlText w:val="o"/>
+      <w:lvlJc w:val="left"/>
+      <w:pPr>
+        <w:ind w:left="5760" w:hanging="360"/>
+      </w:pPr>
+      <w:rPr>
+        <w:rFonts w:ascii="Courier New" w:hAnsi="Courier New" w:cs="Courier New" w:hint="default"/>
+      </w:rPr>
+    </w:lvl>
+    <w:lvl w:ilvl="8" w:tplc="04090005" w:tentative="1">
+      <w:start w:val="1"/>
+      <w:numFmt w:val="bullet"/>
+      <w:lvlText w:val=""/>
+      <w:lvlJc w:val="left"/>
+      <w:pPr>
+        <w:ind w:left="6480" w:hanging="360"/>
+      </w:pPr>
+      <w:rPr>
+        <w:rFonts w:ascii="Wingdings" w:hAnsi="Wingdings" w:hint="default"/>
+      </w:rPr>
+    </w:lvl>
+  </w:abstractNum>
+  <w:abstractNum w:abstractNumId="3" w15:restartNumberingAfterBreak="0">
+    <w:nsid w:val="26EA1CF1"/>
+    <w:multiLevelType w:val="hybridMultilevel"/>
+    <w:tmpl w:val="E6667BD8"/>
+    <w:lvl w:ilvl="0" w:tplc="ED522020">
       <w:numFmt w:val="bullet"/>
       <w:lvlText w:val=""/>
       <w:lvlJc w:val="left"/>
@@ -3487,11 +5144,247 @@
       </w:rPr>
     </w:lvl>
   </w:abstractNum>
+  <w:abstractNum w:abstractNumId="4" w15:restartNumberingAfterBreak="0">
+    <w:nsid w:val="71867EF5"/>
+    <w:multiLevelType w:val="hybridMultilevel"/>
+    <w:tmpl w:val="54CC82F4"/>
+    <w:lvl w:ilvl="0" w:tplc="ED522020">
+      <w:numFmt w:val="bullet"/>
+      <w:lvlText w:val=""/>
+      <w:lvlJc w:val="left"/>
+      <w:pPr>
+        <w:ind w:left="720" w:hanging="360"/>
+      </w:pPr>
+      <w:rPr>
+        <w:rFonts w:ascii="Symbol" w:eastAsiaTheme="minorEastAsia" w:hAnsi="Symbol" w:cstheme="minorBidi" w:hint="default"/>
+      </w:rPr>
+    </w:lvl>
+    <w:lvl w:ilvl="1" w:tplc="04090003">
+      <w:start w:val="1"/>
+      <w:numFmt w:val="bullet"/>
+      <w:lvlText w:val="o"/>
+      <w:lvlJc w:val="left"/>
+      <w:pPr>
+        <w:ind w:left="1440" w:hanging="360"/>
+      </w:pPr>
+      <w:rPr>
+        <w:rFonts w:ascii="Courier New" w:hAnsi="Courier New" w:cs="Courier New" w:hint="default"/>
+      </w:rPr>
+    </w:lvl>
+    <w:lvl w:ilvl="2" w:tplc="04090005">
+      <w:start w:val="1"/>
+      <w:numFmt w:val="bullet"/>
+      <w:lvlText w:val=""/>
+      <w:lvlJc w:val="left"/>
+      <w:pPr>
+        <w:ind w:left="2160" w:hanging="360"/>
+      </w:pPr>
+      <w:rPr>
+        <w:rFonts w:ascii="Wingdings" w:hAnsi="Wingdings" w:hint="default"/>
+      </w:rPr>
+    </w:lvl>
+    <w:lvl w:ilvl="3" w:tplc="04090001" w:tentative="1">
+      <w:start w:val="1"/>
+      <w:numFmt w:val="bullet"/>
+      <w:lvlText w:val=""/>
+      <w:lvlJc w:val="left"/>
+      <w:pPr>
+        <w:ind w:left="2880" w:hanging="360"/>
+      </w:pPr>
+      <w:rPr>
+        <w:rFonts w:ascii="Symbol" w:hAnsi="Symbol" w:hint="default"/>
+      </w:rPr>
+    </w:lvl>
+    <w:lvl w:ilvl="4" w:tplc="04090003" w:tentative="1">
+      <w:start w:val="1"/>
+      <w:numFmt w:val="bullet"/>
+      <w:lvlText w:val="o"/>
+      <w:lvlJc w:val="left"/>
+      <w:pPr>
+        <w:ind w:left="3600" w:hanging="360"/>
+      </w:pPr>
+      <w:rPr>
+        <w:rFonts w:ascii="Courier New" w:hAnsi="Courier New" w:cs="Courier New" w:hint="default"/>
+      </w:rPr>
+    </w:lvl>
+    <w:lvl w:ilvl="5" w:tplc="04090005" w:tentative="1">
+      <w:start w:val="1"/>
+      <w:numFmt w:val="bullet"/>
+      <w:lvlText w:val=""/>
+      <w:lvlJc w:val="left"/>
+      <w:pPr>
+        <w:ind w:left="4320" w:hanging="360"/>
+      </w:pPr>
+      <w:rPr>
+        <w:rFonts w:ascii="Wingdings" w:hAnsi="Wingdings" w:hint="default"/>
+      </w:rPr>
+    </w:lvl>
+    <w:lvl w:ilvl="6" w:tplc="04090001" w:tentative="1">
+      <w:start w:val="1"/>
+      <w:numFmt w:val="bullet"/>
+      <w:lvlText w:val=""/>
+      <w:lvlJc w:val="left"/>
+      <w:pPr>
+        <w:ind w:left="5040" w:hanging="360"/>
+      </w:pPr>
+      <w:rPr>
+        <w:rFonts w:ascii="Symbol" w:hAnsi="Symbol" w:hint="default"/>
+      </w:rPr>
+    </w:lvl>
+    <w:lvl w:ilvl="7" w:tplc="04090003" w:tentative="1">
+      <w:start w:val="1"/>
+      <w:numFmt w:val="bullet"/>
+      <w:lvlText w:val="o"/>
+      <w:lvlJc w:val="left"/>
+      <w:pPr>
+        <w:ind w:left="5760" w:hanging="360"/>
+      </w:pPr>
+      <w:rPr>
+        <w:rFonts w:ascii="Courier New" w:hAnsi="Courier New" w:cs="Courier New" w:hint="default"/>
+      </w:rPr>
+    </w:lvl>
+    <w:lvl w:ilvl="8" w:tplc="04090005" w:tentative="1">
+      <w:start w:val="1"/>
+      <w:numFmt w:val="bullet"/>
+      <w:lvlText w:val=""/>
+      <w:lvlJc w:val="left"/>
+      <w:pPr>
+        <w:ind w:left="6480" w:hanging="360"/>
+      </w:pPr>
+      <w:rPr>
+        <w:rFonts w:ascii="Wingdings" w:hAnsi="Wingdings" w:hint="default"/>
+      </w:rPr>
+    </w:lvl>
+  </w:abstractNum>
+  <w:abstractNum w:abstractNumId="5" w15:restartNumberingAfterBreak="0">
+    <w:nsid w:val="7ADA58FE"/>
+    <w:multiLevelType w:val="hybridMultilevel"/>
+    <w:tmpl w:val="83B6634C"/>
+    <w:lvl w:ilvl="0" w:tplc="1ED40B58">
+      <w:numFmt w:val="bullet"/>
+      <w:lvlText w:val=""/>
+      <w:lvlJc w:val="left"/>
+      <w:pPr>
+        <w:ind w:left="720" w:hanging="360"/>
+      </w:pPr>
+      <w:rPr>
+        <w:rFonts w:ascii="Symbol" w:eastAsiaTheme="minorEastAsia" w:hAnsi="Symbol" w:cstheme="minorBidi" w:hint="default"/>
+      </w:rPr>
+    </w:lvl>
+    <w:lvl w:ilvl="1" w:tplc="04090003">
+      <w:start w:val="1"/>
+      <w:numFmt w:val="bullet"/>
+      <w:lvlText w:val="o"/>
+      <w:lvlJc w:val="left"/>
+      <w:pPr>
+        <w:ind w:left="1440" w:hanging="360"/>
+      </w:pPr>
+      <w:rPr>
+        <w:rFonts w:ascii="Courier New" w:hAnsi="Courier New" w:cs="Courier New" w:hint="default"/>
+      </w:rPr>
+    </w:lvl>
+    <w:lvl w:ilvl="2" w:tplc="04090005" w:tentative="1">
+      <w:start w:val="1"/>
+      <w:numFmt w:val="bullet"/>
+      <w:lvlText w:val=""/>
+      <w:lvlJc w:val="left"/>
+      <w:pPr>
+        <w:ind w:left="2160" w:hanging="360"/>
+      </w:pPr>
+      <w:rPr>
+        <w:rFonts w:ascii="Wingdings" w:hAnsi="Wingdings" w:hint="default"/>
+      </w:rPr>
+    </w:lvl>
+    <w:lvl w:ilvl="3" w:tplc="04090001" w:tentative="1">
+      <w:start w:val="1"/>
+      <w:numFmt w:val="bullet"/>
+      <w:lvlText w:val=""/>
+      <w:lvlJc w:val="left"/>
+      <w:pPr>
+        <w:ind w:left="2880" w:hanging="360"/>
+      </w:pPr>
+      <w:rPr>
+        <w:rFonts w:ascii="Symbol" w:hAnsi="Symbol" w:hint="default"/>
+      </w:rPr>
+    </w:lvl>
+    <w:lvl w:ilvl="4" w:tplc="04090003" w:tentative="1">
+      <w:start w:val="1"/>
+      <w:numFmt w:val="bullet"/>
+      <w:lvlText w:val="o"/>
+      <w:lvlJc w:val="left"/>
+      <w:pPr>
+        <w:ind w:left="3600" w:hanging="360"/>
+      </w:pPr>
+      <w:rPr>
+        <w:rFonts w:ascii="Courier New" w:hAnsi="Courier New" w:cs="Courier New" w:hint="default"/>
+      </w:rPr>
+    </w:lvl>
+    <w:lvl w:ilvl="5" w:tplc="04090005" w:tentative="1">
+      <w:start w:val="1"/>
+      <w:numFmt w:val="bullet"/>
+      <w:lvlText w:val=""/>
+      <w:lvlJc w:val="left"/>
+      <w:pPr>
+        <w:ind w:left="4320" w:hanging="360"/>
+      </w:pPr>
+      <w:rPr>
+        <w:rFonts w:ascii="Wingdings" w:hAnsi="Wingdings" w:hint="default"/>
+      </w:rPr>
+    </w:lvl>
+    <w:lvl w:ilvl="6" w:tplc="04090001" w:tentative="1">
+      <w:start w:val="1"/>
+      <w:numFmt w:val="bullet"/>
+      <w:lvlText w:val=""/>
+      <w:lvlJc w:val="left"/>
+      <w:pPr>
+        <w:ind w:left="5040" w:hanging="360"/>
+      </w:pPr>
+      <w:rPr>
+        <w:rFonts w:ascii="Symbol" w:hAnsi="Symbol" w:hint="default"/>
+      </w:rPr>
+    </w:lvl>
+    <w:lvl w:ilvl="7" w:tplc="04090003" w:tentative="1">
+      <w:start w:val="1"/>
+      <w:numFmt w:val="bullet"/>
+      <w:lvlText w:val="o"/>
+      <w:lvlJc w:val="left"/>
+      <w:pPr>
+        <w:ind w:left="5760" w:hanging="360"/>
+      </w:pPr>
+      <w:rPr>
+        <w:rFonts w:ascii="Courier New" w:hAnsi="Courier New" w:cs="Courier New" w:hint="default"/>
+      </w:rPr>
+    </w:lvl>
+    <w:lvl w:ilvl="8" w:tplc="04090005" w:tentative="1">
+      <w:start w:val="1"/>
+      <w:numFmt w:val="bullet"/>
+      <w:lvlText w:val=""/>
+      <w:lvlJc w:val="left"/>
+      <w:pPr>
+        <w:ind w:left="6480" w:hanging="360"/>
+      </w:pPr>
+      <w:rPr>
+        <w:rFonts w:ascii="Wingdings" w:hAnsi="Wingdings" w:hint="default"/>
+      </w:rPr>
+    </w:lvl>
+  </w:abstractNum>
   <w:num w:numId="1" w16cid:durableId="400491710">
+    <w:abstractNumId w:val="1"/>
+  </w:num>
+  <w:num w:numId="2" w16cid:durableId="1039546531">
+    <w:abstractNumId w:val="5"/>
+  </w:num>
+  <w:num w:numId="3" w16cid:durableId="1750300552">
+    <w:abstractNumId w:val="4"/>
+  </w:num>
+  <w:num w:numId="4" w16cid:durableId="2000379964">
+    <w:abstractNumId w:val="3"/>
+  </w:num>
+  <w:num w:numId="5" w16cid:durableId="1552765937">
     <w:abstractNumId w:val="0"/>
   </w:num>
-  <w:num w:numId="2" w16cid:durableId="1039546531">
-    <w:abstractNumId w:val="1"/>
+  <w:num w:numId="6" w16cid:durableId="1535802680">
+    <w:abstractNumId w:val="2"/>
   </w:num>
 </w:numbering>
 </file>
@@ -4327,4 +6220,16 @@
     </a:ext>
   </a:extLst>
 </a:theme>
+</file>
+
+<file path=customXml/item1.xml><?xml version="1.0" encoding="utf-8"?>
+<b:Sources xmlns:b="http://schemas.openxmlformats.org/officeDocument/2006/bibliography" xmlns="http://schemas.openxmlformats.org/officeDocument/2006/bibliography" SelectedStyle="\APASixthEditionOfficeOnline.xsl" StyleName="APA" Version="6"/>
+</file>
+
+<file path=customXml/itemProps1.xml><?xml version="1.0" encoding="utf-8"?>
+<ds:datastoreItem xmlns:ds="http://schemas.openxmlformats.org/officeDocument/2006/customXml" ds:itemID="{AE054C75-F573-454A-AC3C-A1B0CA90792B}">
+  <ds:schemaRefs>
+    <ds:schemaRef ds:uri="http://schemas.openxmlformats.org/officeDocument/2006/bibliography"/>
+  </ds:schemaRefs>
+</ds:datastoreItem>
 </file>
</xml_diff>